<commit_message>
docs: Dialogos.docx e Roteiro.docx com o aviso do Zane sobre as duas salas
Dialogos 0.2: as falas novas na cena 3.1 e o trecho "salas" na 3.2.
Roteiro 0.10: resumos das conversas e o caderno da cena 3.1.

Co-Authored-By: Claude Opus 5.5 <noreply@anthropic.com>
</commit_message>
<xml_diff>
--- a/docs/historia/dialogos/Dialogos.docx
+++ b/docs/historia/dialogos/Dialogos.docx
@@ -133,7 +133,7 @@
             </w:pPr>
             <w:r>
               <w:rPr/>
-              <w:t>0.1 — Rascunho</w:t>
+              <w:t>0.2 — Rascunho</w:t>
             </w:r>
           </w:p>
         </w:tc>
@@ -7553,7 +7553,7 @@
             </w:pPr>
             <w:r>
               <w:rPr/>
-              <w:t>Apresenta o problema: a mesma trava lacra a saída e o bunker, e lê três nós de controle. O Zane desconfia do Henrique.</w:t>
+              <w:t>Apresenta o problema: a mesma trava lacra a saída e o bunker, e lê três nós de controle. O Zane desconfia do Henrique. No fim, avisa de duas salas fora do mapa: a parede quente do corredor de cima e a porta âmbar.</w:t>
             </w:r>
           </w:p>
         </w:tc>
@@ -7895,7 +7895,7 @@
             </w:pPr>
             <w:r>
               <w:rPr/>
-              <w:t>Dicas: como invadir um nó, como são os robôs e por que desconfiar do Henrique.</w:t>
+              <w:t>Dicas: como invadir um nó, como são os robôs, por que desconfiar do Henrique e as duas salas fora do mapa.</w:t>
             </w:r>
           </w:p>
         </w:tc>
@@ -9239,6 +9239,126 @@
     </w:p>
     <w:p>
       <w:pPr>
+        <w:pStyle w:val="Personagem"/>
+        <w:rPr/>
+      </w:pPr>
+      <w:r>
+        <w:rPr/>
+        <w:t xml:space="preserve">ZANE (desconfiado)</w:t>
+      </w:r>
+    </w:p>
+    <w:p>
+      <w:pPr>
+        <w:pStyle w:val="Dialogo"/>
+        <w:rPr/>
+      </w:pPr>
+      <w:r>
+        <w:rPr/>
+        <w:t xml:space="preserve">Ah, e duas coisas que não batem com o meu mapa. Uma parede no corredor de cima esquenta toda noite, como se tivesse gente do outro lado.</w:t>
+      </w:r>
+    </w:p>
+    <w:p>
+      <w:pPr>
+        <w:pStyle w:val="Personagem"/>
+        <w:rPr/>
+      </w:pPr>
+      <w:r>
+        <w:rPr/>
+        <w:t xml:space="preserve">GABRIEL (preocupado)</w:t>
+      </w:r>
+    </w:p>
+    <w:p>
+      <w:pPr>
+        <w:pStyle w:val="Dialogo"/>
+        <w:rPr/>
+      </w:pPr>
+      <w:r>
+        <w:rPr/>
+        <w:t xml:space="preserve">E se for robô?</w:t>
+      </w:r>
+    </w:p>
+    <w:p>
+      <w:pPr>
+        <w:pStyle w:val="Personagem"/>
+        <w:rPr/>
+      </w:pPr>
+      <w:r>
+        <w:rPr/>
+        <w:t xml:space="preserve">ZANE</w:t>
+      </w:r>
+    </w:p>
+    <w:p>
+      <w:pPr>
+        <w:pStyle w:val="Dialogo"/>
+        <w:rPr/>
+      </w:pPr>
+      <w:r>
+        <w:rPr/>
+        <w:t xml:space="preserve">Robô é frio. Aquilo é quente que nem gente. Quando passar por lá, aponta a lanterna pra parede. Luz mostra o que o concreto esconde.</w:t>
+      </w:r>
+    </w:p>
+    <w:p>
+      <w:pPr>
+        <w:pStyle w:val="Personagem"/>
+        <w:rPr/>
+      </w:pPr>
+      <w:r>
+        <w:rPr/>
+        <w:t xml:space="preserve">ZANE (empolgado)</w:t>
+      </w:r>
+    </w:p>
+    <w:p>
+      <w:pPr>
+        <w:pStyle w:val="Dialogo"/>
+        <w:rPr/>
+      </w:pPr>
+      <w:r>
+        <w:rPr/>
+        <w:t xml:space="preserve">A outra é uma porta com luz âmbar, no meio do caminho entre os nós. Não dá em nó nenhum. O pouco que eu leio do sistema diz: sala de teste, mecanismo antigo e um cronômetro ligado.</w:t>
+      </w:r>
+    </w:p>
+    <w:p>
+      <w:pPr>
+        <w:pStyle w:val="Personagem"/>
+        <w:rPr/>
+      </w:pPr>
+      <w:r>
+        <w:rPr/>
+        <w:t xml:space="preserve">GABRIEL</w:t>
+      </w:r>
+    </w:p>
+    <w:p>
+      <w:pPr>
+        <w:pStyle w:val="Dialogo"/>
+        <w:rPr/>
+      </w:pPr>
+      <w:r>
+        <w:rPr/>
+        <w:t xml:space="preserve">Puzzle contra o relógio num labirinto cheio de robô. Adoro.</w:t>
+      </w:r>
+    </w:p>
+    <w:p>
+      <w:pPr>
+        <w:pStyle w:val="Personagem"/>
+        <w:rPr/>
+      </w:pPr>
+      <w:r>
+        <w:rPr/>
+        <w:t xml:space="preserve">ZANE (confiante)</w:t>
+      </w:r>
+    </w:p>
+    <w:p>
+      <w:pPr>
+        <w:pStyle w:val="Dialogo"/>
+        <w:rPr/>
+      </w:pPr>
+      <w:r>
+        <w:rPr/>
+        <w:t xml:space="preserve">Opcional! Mas ninguém monta sala de teste à toa. Quem testou alguma coisa ali deixou rastro. Se der tempo, vai.</w:t>
+      </w:r>
+    </w:p>
+    <w:p>
+      <w:pPr>
         <w:pStyle w:val="Condicao"/>
         <w:rPr/>
       </w:pPr>
@@ -9664,291 +9784,13 @@
       </w:r>
       <w:r>
         <w:rPr/>
-        <w:t>“Até mais, Zane.”</w:t>
+        <w:t>“E aquelas duas salas?”</w:t>
       </w:r>
       <w:r>
         <w:rPr>
           <w:color w:val="7A8794"/>
         </w:rPr>
-        <w:t xml:space="preserve">   → tchau</w:t>
-      </w:r>
-    </w:p>
-    <w:p>
-      <w:pPr>
-        <w:pStyle w:val="Trecho"/>
-        <w:rPr/>
-      </w:pPr>
-      <w:r>
-        <w:rPr>
-          <w:b/>
-          <w:bCs/>
-        </w:rPr>
-        <w:t xml:space="preserve">TRECHO  </w:t>
-      </w:r>
-      <w:r>
-        <w:rPr/>
-        <w:t>como</w:t>
-      </w:r>
-    </w:p>
-    <w:p>
-      <w:pPr>
-        <w:pStyle w:val="Personagem"/>
-        <w:rPr/>
-      </w:pPr>
-      <w:r>
-        <w:rPr/>
-        <w:t>ZANE (confiante)</w:t>
-      </w:r>
-    </w:p>
-    <w:p>
-      <w:pPr>
-        <w:pStyle w:val="Dialogo"/>
-        <w:rPr/>
-      </w:pPr>
-      <w:r>
-        <w:rPr/>
-        <w:t>Toma o meu notebook de pesquisa. Chega perto do terminal do nó, equipa e aciona: abre um joguinho de invasão. Acertou, o nó cai.</w:t>
-      </w:r>
-    </w:p>
-    <w:p>
-      <w:pPr>
-        <w:pStyle w:val="Personagem"/>
-        <w:rPr/>
-      </w:pPr>
-      <w:r>
-        <w:rPr/>
-        <w:t>ZANE</w:t>
-      </w:r>
-    </w:p>
-    <w:p>
-      <w:pPr>
-        <w:pStyle w:val="Dialogo"/>
-        <w:rPr/>
-      </w:pPr>
-      <w:r>
-        <w:rPr/>
-        <w:t>Nos nós não gasta bateria: o terminal alimenta o notebook. Pode errar à vontade, só não erra perto de robô.</w:t>
-      </w:r>
-    </w:p>
-    <w:p>
-      <w:pPr>
-        <w:pStyle w:val="Fluxo"/>
-        <w:rPr/>
-      </w:pPr>
-      <w:r>
-        <w:rPr/>
-        <w:t>segue para o trecho oficina_menu</w:t>
-      </w:r>
-    </w:p>
-    <w:p>
-      <w:pPr>
-        <w:pStyle w:val="Trecho"/>
-        <w:rPr/>
-      </w:pPr>
-      <w:r>
-        <w:rPr>
-          <w:b/>
-          <w:bCs/>
-        </w:rPr>
-        <w:t xml:space="preserve">TRECHO  </w:t>
-      </w:r>
-      <w:r>
-        <w:rPr/>
-        <w:t>robos</w:t>
-      </w:r>
-    </w:p>
-    <w:p>
-      <w:pPr>
-        <w:pStyle w:val="Personagem"/>
-        <w:rPr/>
-      </w:pPr>
-      <w:r>
-        <w:rPr/>
-        <w:t>ZANE (assustado)</w:t>
-      </w:r>
-    </w:p>
-    <w:p>
-      <w:pPr>
-        <w:pStyle w:val="Dialogo"/>
-        <w:rPr/>
-      </w:pPr>
-      <w:r>
-        <w:rPr/>
-        <w:t>Uns seis, na última contagem. A Sentinela é a alta, de olho vermelho: vê longe, e mais longe ainda com a sua lanterna acesa.</w:t>
-      </w:r>
-    </w:p>
-    <w:p>
-      <w:pPr>
-        <w:pStyle w:val="Personagem"/>
-        <w:rPr/>
-      </w:pPr>
-      <w:r>
-        <w:rPr/>
-        <w:t>ZANE</w:t>
-      </w:r>
-    </w:p>
-    <w:p>
-      <w:pPr>
-        <w:pStyle w:val="Dialogo"/>
-        <w:rPr/>
-      </w:pPr>
-      <w:r>
-        <w:rPr/>
-        <w:t>O Rastreador é o baixinho, de antena. Quase não enxerga, mas ouve tudo. Correr perto dele é pedir pra morrer.</w:t>
-      </w:r>
-    </w:p>
-    <w:p>
-      <w:pPr>
-        <w:pStyle w:val="Personagem"/>
-        <w:rPr/>
-      </w:pPr>
-      <w:r>
-        <w:rPr/>
-        <w:t>ZANE (confiante)</w:t>
-      </w:r>
-    </w:p>
-    <w:p>
-      <w:pPr>
-        <w:pStyle w:val="Dialogo"/>
-        <w:rPr/>
-      </w:pPr>
-      <w:r>
-        <w:rPr/>
-        <w:t>Anda devagar, apaga a lanterna quando precisar e usa os cantos. Cada salão tem uma entrada só, então olha antes de entrar.</w:t>
-      </w:r>
-    </w:p>
-    <w:p>
-      <w:pPr>
-        <w:pStyle w:val="Fluxo"/>
-        <w:rPr/>
-      </w:pPr>
-      <w:r>
-        <w:rPr/>
-        <w:t>segue para o trecho oficina_menu</w:t>
-      </w:r>
-    </w:p>
-    <w:p>
-      <w:pPr>
-        <w:pStyle w:val="Trecho"/>
-        <w:rPr/>
-      </w:pPr>
-      <w:r>
-        <w:rPr>
-          <w:b/>
-          <w:bCs/>
-        </w:rPr>
-        <w:t xml:space="preserve">TRECHO  </w:t>
-      </w:r>
-      <w:r>
-        <w:rPr/>
-        <w:t>henrique</w:t>
-      </w:r>
-    </w:p>
-    <w:p>
-      <w:pPr>
-        <w:pStyle w:val="Personagem"/>
-        <w:rPr/>
-      </w:pPr>
-      <w:r>
-        <w:rPr/>
-        <w:t>GABRIEL</w:t>
-      </w:r>
-    </w:p>
-    <w:p>
-      <w:pPr>
-        <w:pStyle w:val="Dialogo"/>
-        <w:rPr/>
-      </w:pPr>
-      <w:r>
-        <w:rPr/>
-        <w:t>As dicas dele me trouxeram até aqui. Funcionaram.</w:t>
-      </w:r>
-    </w:p>
-    <w:p>
-      <w:pPr>
-        <w:pStyle w:val="Personagem"/>
-        <w:rPr/>
-      </w:pPr>
-      <w:r>
-        <w:rPr/>
-        <w:t>ZANE (desconfiado)</w:t>
-      </w:r>
-    </w:p>
-    <w:p>
-      <w:pPr>
-        <w:pStyle w:val="Dialogo"/>
-        <w:rPr/>
-      </w:pPr>
-      <w:r>
-        <w:rPr/>
-        <w:t>Funcionar, funcionam. Toda ronda que ele passa bate certinho.</w:t>
-      </w:r>
-    </w:p>
-    <w:p>
-      <w:pPr>
-        <w:pStyle w:val="Personagem"/>
-        <w:rPr/>
-      </w:pPr>
-      <w:r>
-        <w:rPr/>
-        <w:t>ZANE (frustrado)</w:t>
-      </w:r>
-    </w:p>
-    <w:p>
-      <w:pPr>
-        <w:pStyle w:val="Dialogo"/>
-        <w:rPr/>
-      </w:pPr>
-      <w:r>
-        <w:rPr/>
-        <w:t>Mas ele nunca pede ajuda, nunca chama ninguém pra lá. Ninguém conserta nada sozinho e calado desse jeito. Ninguém.</w:t>
-      </w:r>
-    </w:p>
-    <w:p>
-      <w:pPr>
-        <w:pStyle w:val="Personagem"/>
-        <w:rPr/>
-      </w:pPr>
-      <w:r>
-        <w:rPr/>
-        <w:t>ZANE</w:t>
-      </w:r>
-    </w:p>
-    <w:p>
-      <w:pPr>
-        <w:pStyle w:val="Dialogo"/>
-        <w:rPr/>
-      </w:pPr>
-      <w:r>
-        <w:rPr/>
-        <w:t>Sei lá. Pode ser só o jeito dele. É por isso que eu quero ver.</w:t>
-      </w:r>
-    </w:p>
-    <w:p>
-      <w:pPr>
-        <w:pStyle w:val="Fluxo"/>
-        <w:rPr/>
-      </w:pPr>
-      <w:r>
-        <w:rPr/>
-        <w:t>segue para o trecho oficina_menu</w:t>
-      </w:r>
-    </w:p>
-    <w:p>
-      <w:pPr>
-        <w:pStyle w:val="Trecho"/>
-        <w:rPr/>
-      </w:pPr>
-      <w:r>
-        <w:rPr>
-          <w:b/>
-          <w:bCs/>
-        </w:rPr>
-        <w:t xml:space="preserve">TRECHO  </w:t>
-      </w:r>
-      <w:r>
-        <w:rPr/>
-        <w:t>oficina_menu</w:t>
+        <w:t xml:space="preserve">   → salas</w:t>
       </w:r>
     </w:p>
     <w:p>
@@ -9966,13 +9808,358 @@
       </w:r>
       <w:r>
         <w:rPr/>
-        <w:t>“Como eu invado um nó?”</w:t>
+        <w:t>“Até mais, Zane.”</w:t>
       </w:r>
       <w:r>
         <w:rPr>
           <w:color w:val="7A8794"/>
         </w:rPr>
-        <w:t xml:space="preserve">   → como</w:t>
+        <w:t xml:space="preserve">   → tchau</w:t>
+      </w:r>
+    </w:p>
+    <w:p>
+      <w:pPr>
+        <w:pStyle w:val="Trecho"/>
+        <w:rPr/>
+      </w:pPr>
+      <w:r>
+        <w:rPr>
+          <w:b/>
+          <w:bCs/>
+        </w:rPr>
+        <w:t xml:space="preserve">TRECHO  </w:t>
+      </w:r>
+      <w:r>
+        <w:rPr/>
+        <w:t>como</w:t>
+      </w:r>
+    </w:p>
+    <w:p>
+      <w:pPr>
+        <w:pStyle w:val="Personagem"/>
+        <w:rPr/>
+      </w:pPr>
+      <w:r>
+        <w:rPr/>
+        <w:t>ZANE (confiante)</w:t>
+      </w:r>
+    </w:p>
+    <w:p>
+      <w:pPr>
+        <w:pStyle w:val="Dialogo"/>
+        <w:rPr/>
+      </w:pPr>
+      <w:r>
+        <w:rPr/>
+        <w:t>Toma o meu notebook de pesquisa. Chega perto do terminal do nó, equipa e aciona: abre um joguinho de invasão. Acertou, o nó cai.</w:t>
+      </w:r>
+    </w:p>
+    <w:p>
+      <w:pPr>
+        <w:pStyle w:val="Personagem"/>
+        <w:rPr/>
+      </w:pPr>
+      <w:r>
+        <w:rPr/>
+        <w:t>ZANE</w:t>
+      </w:r>
+    </w:p>
+    <w:p>
+      <w:pPr>
+        <w:pStyle w:val="Dialogo"/>
+        <w:rPr/>
+      </w:pPr>
+      <w:r>
+        <w:rPr/>
+        <w:t>Nos nós não gasta bateria: o terminal alimenta o notebook. Pode errar à vontade, só não erra perto de robô.</w:t>
+      </w:r>
+    </w:p>
+    <w:p>
+      <w:pPr>
+        <w:pStyle w:val="Fluxo"/>
+        <w:rPr/>
+      </w:pPr>
+      <w:r>
+        <w:rPr/>
+        <w:t>segue para o trecho oficina_menu</w:t>
+      </w:r>
+    </w:p>
+    <w:p>
+      <w:pPr>
+        <w:pStyle w:val="Trecho"/>
+        <w:rPr/>
+      </w:pPr>
+      <w:r>
+        <w:rPr>
+          <w:b/>
+          <w:bCs/>
+        </w:rPr>
+        <w:t xml:space="preserve">TRECHO  </w:t>
+      </w:r>
+      <w:r>
+        <w:rPr/>
+        <w:t>robos</w:t>
+      </w:r>
+    </w:p>
+    <w:p>
+      <w:pPr>
+        <w:pStyle w:val="Personagem"/>
+        <w:rPr/>
+      </w:pPr>
+      <w:r>
+        <w:rPr/>
+        <w:t>ZANE (assustado)</w:t>
+      </w:r>
+    </w:p>
+    <w:p>
+      <w:pPr>
+        <w:pStyle w:val="Dialogo"/>
+        <w:rPr/>
+      </w:pPr>
+      <w:r>
+        <w:rPr/>
+        <w:t>Uns seis, na última contagem. A Sentinela é a alta, de olho vermelho: vê longe, e mais longe ainda com a sua lanterna acesa.</w:t>
+      </w:r>
+    </w:p>
+    <w:p>
+      <w:pPr>
+        <w:pStyle w:val="Personagem"/>
+        <w:rPr/>
+      </w:pPr>
+      <w:r>
+        <w:rPr/>
+        <w:t>ZANE</w:t>
+      </w:r>
+    </w:p>
+    <w:p>
+      <w:pPr>
+        <w:pStyle w:val="Dialogo"/>
+        <w:rPr/>
+      </w:pPr>
+      <w:r>
+        <w:rPr/>
+        <w:t>O Rastreador é o baixinho, de antena. Quase não enxerga, mas ouve tudo. Correr perto dele é pedir pra morrer.</w:t>
+      </w:r>
+    </w:p>
+    <w:p>
+      <w:pPr>
+        <w:pStyle w:val="Personagem"/>
+        <w:rPr/>
+      </w:pPr>
+      <w:r>
+        <w:rPr/>
+        <w:t>ZANE (confiante)</w:t>
+      </w:r>
+    </w:p>
+    <w:p>
+      <w:pPr>
+        <w:pStyle w:val="Dialogo"/>
+        <w:rPr/>
+      </w:pPr>
+      <w:r>
+        <w:rPr/>
+        <w:t>Anda devagar, apaga a lanterna quando precisar e usa os cantos. Cada salão tem uma entrada só, então olha antes de entrar.</w:t>
+      </w:r>
+    </w:p>
+    <w:p>
+      <w:pPr>
+        <w:pStyle w:val="Fluxo"/>
+        <w:rPr/>
+      </w:pPr>
+      <w:r>
+        <w:rPr/>
+        <w:t>segue para o trecho oficina_menu</w:t>
+      </w:r>
+    </w:p>
+    <w:p>
+      <w:pPr>
+        <w:pStyle w:val="Trecho"/>
+        <w:rPr/>
+      </w:pPr>
+      <w:r>
+        <w:rPr>
+          <w:b/>
+          <w:bCs/>
+        </w:rPr>
+        <w:t xml:space="preserve">TRECHO  </w:t>
+      </w:r>
+      <w:r>
+        <w:rPr/>
+        <w:t>henrique</w:t>
+      </w:r>
+    </w:p>
+    <w:p>
+      <w:pPr>
+        <w:pStyle w:val="Personagem"/>
+        <w:rPr/>
+      </w:pPr>
+      <w:r>
+        <w:rPr/>
+        <w:t>GABRIEL</w:t>
+      </w:r>
+    </w:p>
+    <w:p>
+      <w:pPr>
+        <w:pStyle w:val="Dialogo"/>
+        <w:rPr/>
+      </w:pPr>
+      <w:r>
+        <w:rPr/>
+        <w:t>As dicas dele me trouxeram até aqui. Funcionaram.</w:t>
+      </w:r>
+    </w:p>
+    <w:p>
+      <w:pPr>
+        <w:pStyle w:val="Personagem"/>
+        <w:rPr/>
+      </w:pPr>
+      <w:r>
+        <w:rPr/>
+        <w:t>ZANE (desconfiado)</w:t>
+      </w:r>
+    </w:p>
+    <w:p>
+      <w:pPr>
+        <w:pStyle w:val="Dialogo"/>
+        <w:rPr/>
+      </w:pPr>
+      <w:r>
+        <w:rPr/>
+        <w:t>Funcionar, funcionam. Toda ronda que ele passa bate certinho.</w:t>
+      </w:r>
+    </w:p>
+    <w:p>
+      <w:pPr>
+        <w:pStyle w:val="Personagem"/>
+        <w:rPr/>
+      </w:pPr>
+      <w:r>
+        <w:rPr/>
+        <w:t>ZANE (frustrado)</w:t>
+      </w:r>
+    </w:p>
+    <w:p>
+      <w:pPr>
+        <w:pStyle w:val="Dialogo"/>
+        <w:rPr/>
+      </w:pPr>
+      <w:r>
+        <w:rPr/>
+        <w:t>Mas ele nunca pede ajuda, nunca chama ninguém pra lá. Ninguém conserta nada sozinho e calado desse jeito. Ninguém.</w:t>
+      </w:r>
+    </w:p>
+    <w:p>
+      <w:pPr>
+        <w:pStyle w:val="Personagem"/>
+        <w:rPr/>
+      </w:pPr>
+      <w:r>
+        <w:rPr/>
+        <w:t>ZANE</w:t>
+      </w:r>
+    </w:p>
+    <w:p>
+      <w:pPr>
+        <w:pStyle w:val="Dialogo"/>
+        <w:rPr/>
+      </w:pPr>
+      <w:r>
+        <w:rPr/>
+        <w:t>Sei lá. Pode ser só o jeito dele. É por isso que eu quero ver.</w:t>
+      </w:r>
+    </w:p>
+    <w:p>
+      <w:pPr>
+        <w:pStyle w:val="Fluxo"/>
+        <w:rPr/>
+      </w:pPr>
+      <w:r>
+        <w:rPr/>
+        <w:t>segue para o trecho oficina_menu</w:t>
+      </w:r>
+    </w:p>
+    <w:p>
+      <w:pPr>
+        <w:pStyle w:val="Trecho"/>
+        <w:rPr/>
+      </w:pPr>
+      <w:r>
+        <w:rPr>
+          <w:b/>
+          <w:bCs/>
+        </w:rPr>
+        <w:t xml:space="preserve">TRECHO  </w:t>
+      </w:r>
+      <w:r>
+        <w:rPr/>
+        <w:t>salas</w:t>
+      </w:r>
+    </w:p>
+    <w:p>
+      <w:pPr>
+        <w:pStyle w:val="Personagem"/>
+        <w:rPr/>
+      </w:pPr>
+      <w:r>
+        <w:rPr/>
+        <w:t xml:space="preserve">ZANE (desconfiado)</w:t>
+      </w:r>
+    </w:p>
+    <w:p>
+      <w:pPr>
+        <w:pStyle w:val="Dialogo"/>
+        <w:rPr/>
+      </w:pPr>
+      <w:r>
+        <w:rPr/>
+        <w:t xml:space="preserve">A parede do corredor de cima continua quente. Aponta a lanterna pra ela quando passar: luz mostra o que o concreto esconde.</w:t>
+      </w:r>
+    </w:p>
+    <w:p>
+      <w:pPr>
+        <w:pStyle w:val="Personagem"/>
+        <w:rPr/>
+      </w:pPr>
+      <w:r>
+        <w:rPr/>
+        <w:t xml:space="preserve">ZANE</w:t>
+      </w:r>
+    </w:p>
+    <w:p>
+      <w:pPr>
+        <w:pStyle w:val="Dialogo"/>
+        <w:rPr/>
+      </w:pPr>
+      <w:r>
+        <w:rPr/>
+        <w:t xml:space="preserve">E a porta âmbar, entre os nós, é a sala de teste com cronômetro. Opcional. Só entra com tempo e cabeça fresca.</w:t>
+      </w:r>
+    </w:p>
+    <w:p>
+      <w:pPr>
+        <w:pStyle w:val="Fluxo"/>
+        <w:rPr/>
+      </w:pPr>
+      <w:r>
+        <w:rPr/>
+        <w:t>segue para o trecho oficina_menu</w:t>
+      </w:r>
+    </w:p>
+    <w:p>
+      <w:pPr>
+        <w:pStyle w:val="Trecho"/>
+        <w:rPr/>
+      </w:pPr>
+      <w:r>
+        <w:rPr>
+          <w:b/>
+          <w:bCs/>
+        </w:rPr>
+        <w:t xml:space="preserve">TRECHO  </w:t>
+      </w:r>
+      <w:r>
+        <w:rPr/>
+        <w:t>oficina_menu</w:t>
       </w:r>
     </w:p>
     <w:p>
@@ -9990,13 +10177,13 @@
       </w:r>
       <w:r>
         <w:rPr/>
-        <w:t>“E os robôs?”</w:t>
+        <w:t>“Como eu invado um nó?”</w:t>
       </w:r>
       <w:r>
         <w:rPr>
           <w:color w:val="7A8794"/>
         </w:rPr>
-        <w:t xml:space="preserve">   → robos</w:t>
+        <w:t xml:space="preserve">   → como</w:t>
       </w:r>
     </w:p>
     <w:p>
@@ -10014,6 +10201,30 @@
       </w:r>
       <w:r>
         <w:rPr/>
+        <w:t>“E os robôs?”</w:t>
+      </w:r>
+      <w:r>
+        <w:rPr>
+          <w:color w:val="7A8794"/>
+        </w:rPr>
+        <w:t xml:space="preserve">   → robos</w:t>
+      </w:r>
+    </w:p>
+    <w:p>
+      <w:pPr>
+        <w:pStyle w:val="Escolha"/>
+        <w:rPr/>
+      </w:pPr>
+      <w:r>
+        <w:rPr>
+          <w:b/>
+          <w:bCs/>
+          <w:color w:val="2A7F8E"/>
+        </w:rPr>
+        <w:t xml:space="preserve">ESCOLHA  </w:t>
+      </w:r>
+      <w:r>
+        <w:rPr/>
         <w:t>“Por que desconfiar do Henrique?”</w:t>
       </w:r>
       <w:r>
@@ -10021,6 +10232,30 @@
           <w:color w:val="7A8794"/>
         </w:rPr>
         <w:t xml:space="preserve">   → henrique</w:t>
+      </w:r>
+    </w:p>
+    <w:p>
+      <w:pPr>
+        <w:pStyle w:val="Escolha"/>
+        <w:rPr/>
+      </w:pPr>
+      <w:r>
+        <w:rPr>
+          <w:b/>
+          <w:bCs/>
+          <w:color w:val="2A7F8E"/>
+        </w:rPr>
+        <w:t xml:space="preserve">ESCOLHA  </w:t>
+      </w:r>
+      <w:r>
+        <w:rPr/>
+        <w:t>“E aquelas duas salas?”</w:t>
+      </w:r>
+      <w:r>
+        <w:rPr>
+          <w:color w:val="7A8794"/>
+        </w:rPr>
+        <w:t xml:space="preserve">   → salas</w:t>
       </w:r>
     </w:p>
     <w:p>
@@ -16375,6 +16610,94 @@
             <w:r>
               <w:rPr/>
               <w:t>Falas separadas do Roteiro (versão 0.8): todas as conversas, o rádio, o telefone e o prólogo, ato por ato, com os rascunhos e as revisões das falas.</w:t>
+            </w:r>
+          </w:p>
+        </w:tc>
+      </w:tr>
+      <w:tr>
+        <w:trPr>
+          <w:trHeight w:val="480" w:hRule="atLeast"/>
+        </w:trPr>
+        <w:tc>
+          <w:tcPr>
+            <w:tcW w:w="1100" w:type="dxa"/>
+            <w:tcBorders>
+              <w:top w:val="single" w:sz="4" w:space="0" w:color="BFC9D1"/>
+              <w:start w:val="single" w:sz="4" w:space="0" w:color="BFC9D1"/>
+              <w:bottom w:val="single" w:sz="4" w:space="0" w:color="BFC9D1"/>
+              <w:end w:val="single" w:sz="4" w:space="0" w:color="BFC9D1"/>
+            </w:tcBorders>
+          </w:tcPr>
+          <w:p>
+            <w:pPr>
+              <w:pStyle w:val="Normal"/>
+              <w:rPr/>
+            </w:pPr>
+            <w:r>
+              <w:rPr/>
+              <w:t>0.2</w:t>
+            </w:r>
+          </w:p>
+        </w:tc>
+        <w:tc>
+          <w:tcPr>
+            <w:tcW w:w="1400" w:type="dxa"/>
+            <w:tcBorders>
+              <w:top w:val="single" w:sz="4" w:space="0" w:color="BFC9D1"/>
+              <w:start w:val="single" w:sz="4" w:space="0" w:color="BFC9D1"/>
+              <w:bottom w:val="single" w:sz="4" w:space="0" w:color="BFC9D1"/>
+              <w:end w:val="single" w:sz="4" w:space="0" w:color="BFC9D1"/>
+            </w:tcBorders>
+          </w:tcPr>
+          <w:p>
+            <w:pPr>
+              <w:pStyle w:val="Normal"/>
+              <w:rPr/>
+            </w:pPr>
+            <w:r>
+              <w:rPr/>
+              <w:t>28/10/2026</w:t>
+            </w:r>
+          </w:p>
+        </w:tc>
+        <w:tc>
+          <w:tcPr>
+            <w:tcW w:w="2000" w:type="dxa"/>
+            <w:tcBorders>
+              <w:top w:val="single" w:sz="4" w:space="0" w:color="BFC9D1"/>
+              <w:start w:val="single" w:sz="4" w:space="0" w:color="BFC9D1"/>
+              <w:bottom w:val="single" w:sz="4" w:space="0" w:color="BFC9D1"/>
+              <w:end w:val="single" w:sz="4" w:space="0" w:color="BFC9D1"/>
+            </w:tcBorders>
+          </w:tcPr>
+          <w:p>
+            <w:pPr>
+              <w:pStyle w:val="Normal"/>
+              <w:rPr/>
+            </w:pPr>
+            <w:r>
+              <w:rPr/>
+            </w:r>
+          </w:p>
+        </w:tc>
+        <w:tc>
+          <w:tcPr>
+            <w:tcW w:w="4526" w:type="dxa"/>
+            <w:tcBorders>
+              <w:top w:val="single" w:sz="4" w:space="0" w:color="BFC9D1"/>
+              <w:start w:val="single" w:sz="4" w:space="0" w:color="BFC9D1"/>
+              <w:bottom w:val="single" w:sz="4" w:space="0" w:color="BFC9D1"/>
+              <w:end w:val="single" w:sz="4" w:space="0" w:color="BFC9D1"/>
+            </w:tcBorders>
+          </w:tcPr>
+          <w:p>
+            <w:pPr>
+              <w:pStyle w:val="Normal"/>
+              <w:rPr/>
+            </w:pPr>
+            <w:r>
+              <w:rPr/>
+              <w:t/>
             </w:r>
           </w:p>
         </w:tc>

</xml_diff>

<commit_message>
docs: esconderijo do Baltazar e Corredor do Tempo no Dialogos e no Roteiro
Dialogos 0.3 e Roteiro 0.11: cena 3.3 (as duas conversas do Baltazar no
Labirinto) e cena 3.4 (Corredor do Tempo, com os três documentos). O
alçapão vira a 3.5. Corrige as descrições em branco das versões 0.2 e
0.3 do Dialogos.

Co-Authored-By: Claude Opus 5.5 <noreply@anthropic.com>
</commit_message>
<xml_diff>
--- a/docs/historia/dialogos/Dialogos.docx
+++ b/docs/historia/dialogos/Dialogos.docx
@@ -133,7 +133,7 @@
             </w:pPr>
             <w:r>
               <w:rPr/>
-              <w:t>0.2 — Rascunho</w:t>
+              <w:t>0.3 — Rascunho</w:t>
             </w:r>
           </w:p>
         </w:tc>
@@ -8153,6 +8153,234 @@
                 <w:sz w:val="15"/>
                 <w:szCs w:val="15"/>
               </w:rPr>
+              <w:t>baltazar_labirinto_primeiro_encontro</w:t>
+            </w:r>
+          </w:p>
+        </w:tc>
+        <w:tc>
+          <w:tcPr>
+            <w:tcW w:w="1201" w:type="dxa"/>
+            <w:tcBorders>
+              <w:top w:val="single" w:sz="4" w:space="0" w:color="BFC9D1"/>
+              <w:start w:val="single" w:sz="4" w:space="0" w:color="BFC9D1"/>
+              <w:bottom w:val="single" w:sz="4" w:space="0" w:color="BFC9D1"/>
+              <w:end w:val="single" w:sz="4" w:space="0" w:color="BFC9D1"/>
+            </w:tcBorders>
+          </w:tcPr>
+          <w:p>
+            <w:pPr>
+              <w:pStyle w:val="Normal"/>
+              <w:rPr/>
+            </w:pPr>
+            <w:r>
+              <w:rPr/>
+              <w:t>Baltazar, Gabriel</w:t>
+            </w:r>
+          </w:p>
+        </w:tc>
+        <w:tc>
+          <w:tcPr>
+            <w:tcW w:w="1099" w:type="dxa"/>
+            <w:tcBorders>
+              <w:top w:val="single" w:sz="4" w:space="0" w:color="BFC9D1"/>
+              <w:start w:val="single" w:sz="4" w:space="0" w:color="BFC9D1"/>
+              <w:bottom w:val="single" w:sz="4" w:space="0" w:color="BFC9D1"/>
+              <w:end w:val="single" w:sz="4" w:space="0" w:color="BFC9D1"/>
+            </w:tcBorders>
+          </w:tcPr>
+          <w:p>
+            <w:pPr>
+              <w:pStyle w:val="Normal"/>
+              <w:rPr/>
+            </w:pPr>
+            <w:r>
+              <w:rPr/>
+              <w:t>em pessoa</w:t>
+            </w:r>
+          </w:p>
+        </w:tc>
+        <w:tc>
+          <w:tcPr>
+            <w:tcW w:w="2000" w:type="dxa"/>
+            <w:tcBorders>
+              <w:top w:val="single" w:sz="4" w:space="0" w:color="BFC9D1"/>
+              <w:start w:val="single" w:sz="4" w:space="0" w:color="BFC9D1"/>
+              <w:bottom w:val="single" w:sz="4" w:space="0" w:color="BFC9D1"/>
+              <w:end w:val="single" w:sz="4" w:space="0" w:color="BFC9D1"/>
+            </w:tcBorders>
+          </w:tcPr>
+          <w:p>
+            <w:pPr>
+              <w:pStyle w:val="Normal"/>
+              <w:rPr/>
+            </w:pPr>
+            <w:r>
+              <w:rPr/>
+              <w:t>Cena 3.3. Chegar perto do Baltazar no esconderijo (começa sozinha)</w:t>
+            </w:r>
+          </w:p>
+        </w:tc>
+        <w:tc>
+          <w:tcPr>
+            <w:tcW w:w="2427" w:type="dxa"/>
+            <w:tcBorders>
+              <w:top w:val="single" w:sz="4" w:space="0" w:color="BFC9D1"/>
+              <w:start w:val="single" w:sz="4" w:space="0" w:color="BFC9D1"/>
+              <w:bottom w:val="single" w:sz="4" w:space="0" w:color="BFC9D1"/>
+              <w:end w:val="single" w:sz="4" w:space="0" w:color="BFC9D1"/>
+            </w:tcBorders>
+          </w:tcPr>
+          <w:p>
+            <w:pPr>
+              <w:pStyle w:val="Normal"/>
+              <w:rPr/>
+            </w:pPr>
+            <w:r>
+              <w:rPr/>
+              <w:t>O Baltazar se assusta, acha que é o fim do mundo, conta que seguiu a luz até ali e não quer sair. O Gabriel diz só o primeiro nome: o parentesco fica para depois.</w:t>
+            </w:r>
+          </w:p>
+        </w:tc>
+      </w:tr>
+      <w:tr>
+        <w:trPr>
+          <w:trHeight w:val="480" w:hRule="atLeast"/>
+        </w:trPr>
+        <w:tc>
+          <w:tcPr>
+            <w:tcW w:w="2299" w:type="dxa"/>
+            <w:tcBorders>
+              <w:top w:val="single" w:sz="4" w:space="0" w:color="BFC9D1"/>
+              <w:start w:val="single" w:sz="4" w:space="0" w:color="BFC9D1"/>
+              <w:bottom w:val="single" w:sz="4" w:space="0" w:color="BFC9D1"/>
+              <w:end w:val="single" w:sz="4" w:space="0" w:color="BFC9D1"/>
+            </w:tcBorders>
+          </w:tcPr>
+          <w:p>
+            <w:pPr>
+              <w:pStyle w:val="Normal"/>
+              <w:rPr/>
+            </w:pPr>
+            <w:r>
+              <w:rPr>
+                <w:rFonts w:eastAsia="Courier New" w:cs="Courier New" w:ascii="Courier New" w:hAnsi="Courier New"/>
+                <w:sz w:val="15"/>
+                <w:szCs w:val="15"/>
+              </w:rPr>
+              <w:t>baltazar_labirinto_de_novo</w:t>
+            </w:r>
+          </w:p>
+        </w:tc>
+        <w:tc>
+          <w:tcPr>
+            <w:tcW w:w="1201" w:type="dxa"/>
+            <w:tcBorders>
+              <w:top w:val="single" w:sz="4" w:space="0" w:color="BFC9D1"/>
+              <w:start w:val="single" w:sz="4" w:space="0" w:color="BFC9D1"/>
+              <w:bottom w:val="single" w:sz="4" w:space="0" w:color="BFC9D1"/>
+              <w:end w:val="single" w:sz="4" w:space="0" w:color="BFC9D1"/>
+            </w:tcBorders>
+          </w:tcPr>
+          <w:p>
+            <w:pPr>
+              <w:pStyle w:val="Normal"/>
+              <w:rPr/>
+            </w:pPr>
+            <w:r>
+              <w:rPr/>
+              <w:t>Baltazar, Gabriel</w:t>
+            </w:r>
+          </w:p>
+        </w:tc>
+        <w:tc>
+          <w:tcPr>
+            <w:tcW w:w="1099" w:type="dxa"/>
+            <w:tcBorders>
+              <w:top w:val="single" w:sz="4" w:space="0" w:color="BFC9D1"/>
+              <w:start w:val="single" w:sz="4" w:space="0" w:color="BFC9D1"/>
+              <w:bottom w:val="single" w:sz="4" w:space="0" w:color="BFC9D1"/>
+              <w:end w:val="single" w:sz="4" w:space="0" w:color="BFC9D1"/>
+            </w:tcBorders>
+          </w:tcPr>
+          <w:p>
+            <w:pPr>
+              <w:pStyle w:val="Normal"/>
+              <w:rPr/>
+            </w:pPr>
+            <w:r>
+              <w:rPr/>
+              <w:t>em pessoa</w:t>
+            </w:r>
+          </w:p>
+        </w:tc>
+        <w:tc>
+          <w:tcPr>
+            <w:tcW w:w="2000" w:type="dxa"/>
+            <w:tcBorders>
+              <w:top w:val="single" w:sz="4" w:space="0" w:color="BFC9D1"/>
+              <w:start w:val="single" w:sz="4" w:space="0" w:color="BFC9D1"/>
+              <w:bottom w:val="single" w:sz="4" w:space="0" w:color="BFC9D1"/>
+              <w:end w:val="single" w:sz="4" w:space="0" w:color="BFC9D1"/>
+            </w:tcBorders>
+          </w:tcPr>
+          <w:p>
+            <w:pPr>
+              <w:pStyle w:val="Normal"/>
+              <w:rPr/>
+            </w:pPr>
+            <w:r>
+              <w:rPr/>
+              <w:t>Cena 3.3. Se gabriel voltar a falar com ele</w:t>
+            </w:r>
+          </w:p>
+        </w:tc>
+        <w:tc>
+          <w:tcPr>
+            <w:tcW w:w="2427" w:type="dxa"/>
+            <w:tcBorders>
+              <w:top w:val="single" w:sz="4" w:space="0" w:color="BFC9D1"/>
+              <w:start w:val="single" w:sz="4" w:space="0" w:color="BFC9D1"/>
+              <w:bottom w:val="single" w:sz="4" w:space="0" w:color="BFC9D1"/>
+              <w:end w:val="single" w:sz="4" w:space="0" w:color="BFC9D1"/>
+            </w:tcBorders>
+          </w:tcPr>
+          <w:p>
+            <w:pPr>
+              <w:pStyle w:val="Normal"/>
+              <w:rPr/>
+            </w:pPr>
+            <w:r>
+              <w:rPr/>
+              <w:t>Repete a dica do diário: os robôs de um olho só não veem quem passa pelas costas, e luz forte no olho os cega.</w:t>
+            </w:r>
+          </w:p>
+        </w:tc>
+      </w:tr>
+      <w:tr>
+        <w:trPr>
+          <w:trHeight w:val="480" w:hRule="atLeast"/>
+        </w:trPr>
+        <w:tc>
+          <w:tcPr>
+            <w:tcW w:w="2299" w:type="dxa"/>
+            <w:tcBorders>
+              <w:top w:val="single" w:sz="4" w:space="0" w:color="BFC9D1"/>
+              <w:start w:val="single" w:sz="4" w:space="0" w:color="BFC9D1"/>
+              <w:bottom w:val="single" w:sz="4" w:space="0" w:color="BFC9D1"/>
+              <w:end w:val="single" w:sz="4" w:space="0" w:color="BFC9D1"/>
+            </w:tcBorders>
+          </w:tcPr>
+          <w:p>
+            <w:pPr>
+              <w:pStyle w:val="Normal"/>
+              <w:rPr/>
+            </w:pPr>
+            <w:r>
+              <w:rPr>
+                <w:rFonts w:eastAsia="Courier New" w:cs="Courier New" w:ascii="Courier New" w:hAnsi="Courier New"/>
+                <w:sz w:val="15"/>
+                <w:szCs w:val="15"/>
+              </w:rPr>
               <w:t>zane_labirinto_alcapao</w:t>
             </w:r>
           </w:p>
@@ -8216,7 +8444,7 @@
             </w:pPr>
             <w:r>
               <w:rPr/>
-              <w:t>Cena 3.3. Falar com o Zane depois que a rede do subsolo é invadida</w:t>
+              <w:t>Cena 3.5. Falar com o Zane depois que a rede do subsolo é invadida</w:t>
             </w:r>
           </w:p>
         </w:tc>
@@ -8330,7 +8558,7 @@
             </w:pPr>
             <w:r>
               <w:rPr/>
-              <w:t>Cena 3.3. Se gabriel voltar a falar com ele depois</w:t>
+              <w:t>Cena 3.5. Se gabriel voltar a falar com ele depois</w:t>
             </w:r>
           </w:p>
         </w:tc>
@@ -10608,7 +10836,897 @@
       </w:pPr>
       <w:r>
         <w:rPr/>
-        <w:t>Cena 3.3 — O alçapão</w:t>
+        <w:t xml:space="preserve">Cena 3.3 — O esconderijo do Baltazar</w:t>
+      </w:r>
+    </w:p>
+    <w:p>
+      <w:pPr>
+        <w:pStyle w:val="Cena"/>
+        <w:rPr/>
+      </w:pPr>
+      <w:r>
+        <w:rPr/>
+        <w:t xml:space="preserve">INT. LABIRINTO – ESCONDERIJO DO BALTAZAR – 3026</w:t>
+      </w:r>
+    </w:p>
+    <w:p>
+      <w:pPr>
+        <w:pStyle w:val="Condicao"/>
+        <w:rPr/>
+      </w:pPr>
+      <w:r>
+        <w:rPr/>
+        <w:t xml:space="preserve">QUANDO GABRIEL CHEGA PERTO DELE (A CONVERSA COMEÇA SOZINHA)</w:t>
+      </w:r>
+    </w:p>
+    <w:p>
+      <w:pPr>
+        <w:pStyle w:val="Notaaotime"/>
+        <w:spacing w:before="0" w:after="60"/>
+        <w:rPr/>
+      </w:pPr>
+      <w:r>
+        <w:rPr/>
+        <w:t xml:space="preserve">Diálogo baltazar_labirinto_primeiro_encontro  (dados/dialogos/baltazar_labirinto_primeiro_encontro.json)</w:t>
+      </w:r>
+    </w:p>
+    <w:p>
+      <w:pPr>
+        <w:pStyle w:val="Trecho"/>
+        <w:rPr/>
+      </w:pPr>
+      <w:r>
+        <w:rPr>
+          <w:b/>
+          <w:bCs/>
+        </w:rPr>
+        <w:t xml:space="preserve">TRECHO  </w:t>
+      </w:r>
+      <w:r>
+        <w:rPr/>
+        <w:t>abertura  (começa aqui)</w:t>
+      </w:r>
+    </w:p>
+    <w:p>
+      <w:pPr>
+        <w:pStyle w:val="Personagem"/>
+        <w:rPr/>
+      </w:pPr>
+      <w:r>
+        <w:rPr/>
+        <w:t xml:space="preserve">BALTAZAR (aflito)</w:t>
+      </w:r>
+    </w:p>
+    <w:p>
+      <w:pPr>
+        <w:pStyle w:val="Dialogo"/>
+        <w:rPr/>
+      </w:pPr>
+      <w:r>
+        <w:rPr/>
+        <w:t xml:space="preserve">Alto lá! Nem mais um passo! Vade retro, Satana!</w:t>
+      </w:r>
+    </w:p>
+    <w:p>
+      <w:pPr>
+        <w:pStyle w:val="Dialogo"/>
+        <w:rPr/>
+      </w:pPr>
+      <w:r>
+        <w:rPr/>
+        <w:t xml:space="preserve">Se Vossa Mercê é servo das bestas de ferro, saiba que tenho Deus comigo. E uma vela.</w:t>
+      </w:r>
+    </w:p>
+    <w:p>
+      <w:pPr>
+        <w:pStyle w:val="Personagem"/>
+        <w:rPr/>
+      </w:pPr>
+      <w:r>
+        <w:rPr/>
+        <w:t xml:space="preserve">GABRIEL (surpreso)</w:t>
+      </w:r>
+    </w:p>
+    <w:p>
+      <w:pPr>
+        <w:pStyle w:val="Dialogo"/>
+        <w:rPr/>
+      </w:pPr>
+      <w:r>
+        <w:rPr/>
+        <w:t xml:space="preserve">Calma! Eu sou gente. Gente normal, olha. Sem olho vermelho.</w:t>
+      </w:r>
+    </w:p>
+    <w:p>
+      <w:pPr>
+        <w:pStyle w:val="Personagem"/>
+        <w:rPr/>
+      </w:pPr>
+      <w:r>
+        <w:rPr/>
+        <w:t xml:space="preserve">BALTAZAR (teimoso)</w:t>
+      </w:r>
+    </w:p>
+    <w:p>
+      <w:pPr>
+        <w:pStyle w:val="Dialogo"/>
+        <w:rPr/>
+      </w:pPr>
+      <w:r>
+        <w:rPr/>
+        <w:t xml:space="preserve">Ninguém acha esta porta. Nem as bestas a acharam, e passam aí fora todas as noites. Como a achou Vossa Mercê?</w:t>
+      </w:r>
+    </w:p>
+    <w:p>
+      <w:pPr>
+        <w:pStyle w:val="Personagem"/>
+        <w:rPr/>
+      </w:pPr>
+      <w:r>
+        <w:rPr/>
+        <w:t xml:space="preserve">GABRIEL</w:t>
+      </w:r>
+    </w:p>
+    <w:p>
+      <w:pPr>
+        <w:pStyle w:val="Dialogo"/>
+        <w:rPr/>
+      </w:pPr>
+      <w:r>
+        <w:rPr/>
+        <w:t xml:space="preserve">Com a lanterna. Tinha umas estrelas riscadas na parede. E uma cruz.</w:t>
+      </w:r>
+    </w:p>
+    <w:p>
+      <w:pPr>
+        <w:pStyle w:val="Personagem"/>
+        <w:rPr/>
+      </w:pPr>
+      <w:r>
+        <w:rPr/>
+        <w:t xml:space="preserve">BALTAZAR (encantado)</w:t>
+      </w:r>
+    </w:p>
+    <w:p>
+      <w:pPr>
+        <w:pStyle w:val="Dialogo"/>
+        <w:rPr/>
+      </w:pPr>
+      <w:r>
+        <w:rPr/>
+        <w:t xml:space="preserve">O Cruzeiro! Risquei-o com uma pedra, para saber qual era a minha porta. Cá embaixo não há céu, e eu sem céu me perco.</w:t>
+      </w:r>
+    </w:p>
+    <w:p>
+      <w:pPr>
+        <w:pStyle w:val="Personagem"/>
+        <w:rPr/>
+      </w:pPr>
+      <w:r>
+        <w:rPr/>
+        <w:t xml:space="preserve">BALTAZAR</w:t>
+      </w:r>
+    </w:p>
+    <w:p>
+      <w:pPr>
+        <w:pStyle w:val="Dialogo"/>
+        <w:rPr/>
+      </w:pPr>
+      <w:r>
+        <w:rPr/>
+        <w:t xml:space="preserve">Baltazar, criado de Vossa Mercê. Com quem tenho a honra?</w:t>
+      </w:r>
+    </w:p>
+    <w:p>
+      <w:pPr>
+        <w:pStyle w:val="Personagem"/>
+        <w:rPr/>
+      </w:pPr>
+      <w:r>
+        <w:rPr/>
+        <w:t xml:space="preserve">GABRIEL</w:t>
+      </w:r>
+    </w:p>
+    <w:p>
+      <w:pPr>
+        <w:pStyle w:val="Dialogo"/>
+        <w:rPr/>
+      </w:pPr>
+      <w:r>
+        <w:rPr/>
+        <w:t xml:space="preserve">Gabriel.</w:t>
+      </w:r>
+    </w:p>
+    <w:p>
+      <w:pPr>
+        <w:pStyle w:val="Personagem"/>
+        <w:rPr/>
+      </w:pPr>
+      <w:r>
+        <w:rPr/>
+        <w:t xml:space="preserve">BALTAZAR (rezando)</w:t>
+      </w:r>
+    </w:p>
+    <w:p>
+      <w:pPr>
+        <w:pStyle w:val="Dialogo"/>
+        <w:rPr/>
+      </w:pPr>
+      <w:r>
+        <w:rPr/>
+        <w:t xml:space="preserve">Gabriel. Como o Arcanjo, o que traz as notícias de Deus.</w:t>
+      </w:r>
+    </w:p>
+    <w:p>
+      <w:pPr>
+        <w:pStyle w:val="Personagem"/>
+        <w:rPr/>
+      </w:pPr>
+      <w:r>
+        <w:rPr/>
+        <w:t xml:space="preserve">BALTAZAR (aflito)</w:t>
+      </w:r>
+    </w:p>
+    <w:p>
+      <w:pPr>
+        <w:pStyle w:val="Dialogo"/>
+        <w:rPr/>
+      </w:pPr>
+      <w:r>
+        <w:rPr/>
+        <w:t xml:space="preserve">Então diga logo, que eu aguento: é hoje o fim do mundo?</w:t>
+      </w:r>
+    </w:p>
+    <w:p>
+      <w:pPr>
+        <w:pStyle w:val="Personagem"/>
+        <w:rPr/>
+      </w:pPr>
+      <w:r>
+        <w:rPr/>
+        <w:t xml:space="preserve">GABRIEL</w:t>
+      </w:r>
+    </w:p>
+    <w:p>
+      <w:pPr>
+        <w:pStyle w:val="Dialogo"/>
+        <w:rPr/>
+      </w:pPr>
+      <w:r>
+        <w:rPr/>
+        <w:t xml:space="preserve">Não sei se ajuda, mas o mundo já acabou faz tempo. A gente tá em 3026.</w:t>
+      </w:r>
+    </w:p>
+    <w:p>
+      <w:pPr>
+        <w:pStyle w:val="Personagem"/>
+        <w:rPr/>
+      </w:pPr>
+      <w:r>
+        <w:rPr/>
+        <w:t xml:space="preserve">BALTAZAR (aflito)</w:t>
+      </w:r>
+    </w:p>
+    <w:p>
+      <w:pPr>
+        <w:pStyle w:val="Dialogo"/>
+        <w:rPr/>
+      </w:pPr>
+      <w:r>
+        <w:rPr/>
+        <w:t xml:space="preserve">Três mil e vinte e seis... Anno Domini? Sancta Maria, Mater Dei...</w:t>
+      </w:r>
+    </w:p>
+    <w:p>
+      <w:pPr>
+        <w:pStyle w:val="Personagem"/>
+        <w:rPr/>
+      </w:pPr>
+      <w:r>
+        <w:rPr/>
+        <w:t xml:space="preserve">BALTAZAR (teimoso)</w:t>
+      </w:r>
+    </w:p>
+    <w:p>
+      <w:pPr>
+        <w:pStyle w:val="Dialogo"/>
+        <w:rPr/>
+      </w:pPr>
+      <w:r>
+        <w:rPr/>
+        <w:t xml:space="preserve">Eu bem dizia. Isto é o Tormento de Leviatã, e eu fiquei para trás no Juízo.</w:t>
+      </w:r>
+    </w:p>
+    <w:p>
+      <w:pPr>
+        <w:pStyle w:val="Personagem"/>
+        <w:rPr/>
+      </w:pPr>
+      <w:r>
+        <w:rPr/>
+        <w:t xml:space="preserve">GABRIEL</w:t>
+      </w:r>
+    </w:p>
+    <w:p>
+      <w:pPr>
+        <w:pStyle w:val="Dialogo"/>
+        <w:rPr/>
+      </w:pPr>
+      <w:r>
+        <w:rPr/>
+        <w:t xml:space="preserve">Se é o Juízo, tá bem atrasado. Eu também caí aqui, e não fui o único.</w:t>
+      </w:r>
+    </w:p>
+    <w:p>
+      <w:pPr>
+        <w:pStyle w:val="Fluxo"/>
+        <w:rPr/>
+      </w:pPr>
+      <w:r>
+        <w:rPr/>
+        <w:t>segue para o trecho menu</w:t>
+      </w:r>
+    </w:p>
+    <w:p>
+      <w:pPr>
+        <w:pStyle w:val="Trecho"/>
+        <w:rPr/>
+      </w:pPr>
+      <w:r>
+        <w:rPr>
+          <w:b/>
+          <w:bCs/>
+        </w:rPr>
+        <w:t xml:space="preserve">TRECHO  </w:t>
+      </w:r>
+      <w:r>
+        <w:rPr/>
+        <w:t>menu</w:t>
+      </w:r>
+    </w:p>
+    <w:p>
+      <w:pPr>
+        <w:pStyle w:val="Escolha"/>
+        <w:rPr/>
+      </w:pPr>
+      <w:r>
+        <w:rPr>
+          <w:b/>
+          <w:bCs/>
+          <w:color w:val="2A7F8E"/>
+        </w:rPr>
+        <w:t xml:space="preserve">ESCOLHA  </w:t>
+      </w:r>
+      <w:r>
+        <w:rPr/>
+        <w:t>“Você é o do acampamento da Biblioteca?”</w:t>
+      </w:r>
+      <w:r>
+        <w:rPr>
+          <w:color w:val="7A8794"/>
+        </w:rPr>
+        <w:t xml:space="preserve">   → biblioteca</w:t>
+      </w:r>
+    </w:p>
+    <w:p>
+      <w:pPr>
+        <w:pStyle w:val="Escolha"/>
+        <w:rPr/>
+      </w:pPr>
+      <w:r>
+        <w:rPr>
+          <w:b/>
+          <w:bCs/>
+          <w:color w:val="2A7F8E"/>
+        </w:rPr>
+        <w:t xml:space="preserve">ESCOLHA  </w:t>
+      </w:r>
+      <w:r>
+        <w:rPr/>
+        <w:t>“O que é essa bagunça toda?”</w:t>
+      </w:r>
+      <w:r>
+        <w:rPr>
+          <w:color w:val="7A8794"/>
+        </w:rPr>
+        <w:t xml:space="preserve">   → bagunca</w:t>
+      </w:r>
+    </w:p>
+    <w:p>
+      <w:pPr>
+        <w:pStyle w:val="Escolha"/>
+        <w:rPr/>
+      </w:pPr>
+      <w:r>
+        <w:rPr>
+          <w:b/>
+          <w:bCs/>
+          <w:color w:val="2A7F8E"/>
+        </w:rPr>
+        <w:t xml:space="preserve">ESCOLHA  </w:t>
+      </w:r>
+      <w:r>
+        <w:rPr/>
+        <w:t>“Vem comigo. Tem outras pessoas.”</w:t>
+      </w:r>
+      <w:r>
+        <w:rPr>
+          <w:color w:val="7A8794"/>
+        </w:rPr>
+        <w:t xml:space="preserve">   → convite</w:t>
+      </w:r>
+    </w:p>
+    <w:p>
+      <w:pPr>
+        <w:pStyle w:val="Trecho"/>
+        <w:rPr/>
+      </w:pPr>
+      <w:r>
+        <w:rPr>
+          <w:b/>
+          <w:bCs/>
+        </w:rPr>
+        <w:t xml:space="preserve">TRECHO  </w:t>
+      </w:r>
+      <w:r>
+        <w:rPr/>
+        <w:t>biblioteca</w:t>
+      </w:r>
+    </w:p>
+    <w:p>
+      <w:pPr>
+        <w:pStyle w:val="Personagem"/>
+        <w:rPr/>
+      </w:pPr>
+      <w:r>
+        <w:rPr/>
+        <w:t xml:space="preserve">BALTAZAR (encantado)</w:t>
+      </w:r>
+    </w:p>
+    <w:p>
+      <w:pPr>
+        <w:pStyle w:val="Dialogo"/>
+        <w:rPr/>
+      </w:pPr>
+      <w:r>
+        <w:rPr/>
+        <w:t xml:space="preserve">Vossa Mercê achou o meu diário! Então leu dos olhos de vidro: quem lhes passa pelas costas não é visto.</w:t>
+      </w:r>
+    </w:p>
+    <w:p>
+      <w:pPr>
+        <w:pStyle w:val="Personagem"/>
+        <w:rPr/>
+      </w:pPr>
+      <w:r>
+        <w:rPr/>
+        <w:t xml:space="preserve">BALTAZAR</w:t>
+      </w:r>
+    </w:p>
+    <w:p>
+      <w:pPr>
+        <w:pStyle w:val="Dialogo"/>
+        <w:rPr/>
+      </w:pPr>
+      <w:r>
+        <w:rPr/>
+        <w:t xml:space="preserve">Vi uma luz pela luneta, sobre a mata do sítio de meu pai. Fui ver de perto, e a noite se rasgou como pano velho. Acordei entre aquelas estantes.</w:t>
+      </w:r>
+    </w:p>
+    <w:p>
+      <w:pPr>
+        <w:pStyle w:val="Personagem"/>
+        <w:rPr/>
+      </w:pPr>
+      <w:r>
+        <w:rPr/>
+        <w:t xml:space="preserve">BALTAZAR (rezando)</w:t>
+      </w:r>
+    </w:p>
+    <w:p>
+      <w:pPr>
+        <w:pStyle w:val="Dialogo"/>
+        <w:rPr/>
+      </w:pPr>
+      <w:r>
+        <w:rPr/>
+        <w:t xml:space="preserve">Depois a luz tornou, e eu jurei segui-la até onde ela nasce. Desci atrás dela por escadas de ferro, e no escuro a perdi.</w:t>
+      </w:r>
+    </w:p>
+    <w:p>
+      <w:pPr>
+        <w:pStyle w:val="Personagem"/>
+        <w:rPr/>
+      </w:pPr>
+      <w:r>
+        <w:rPr/>
+        <w:t xml:space="preserve">BALTAZAR</w:t>
+      </w:r>
+    </w:p>
+    <w:p>
+      <w:pPr>
+        <w:pStyle w:val="Dialogo"/>
+        <w:rPr/>
+      </w:pPr>
+      <w:r>
+        <w:rPr/>
+        <w:t xml:space="preserve">Achei esta cova atrás de uma pedra solta. As bestas não a veem. Fiquei.</w:t>
+      </w:r>
+    </w:p>
+    <w:p>
+      <w:pPr>
+        <w:pStyle w:val="Fluxo"/>
+        <w:rPr/>
+      </w:pPr>
+      <w:r>
+        <w:rPr/>
+        <w:t>segue para o trecho menu</w:t>
+      </w:r>
+    </w:p>
+    <w:p>
+      <w:pPr>
+        <w:pStyle w:val="Trecho"/>
+        <w:rPr/>
+      </w:pPr>
+      <w:r>
+        <w:rPr>
+          <w:b/>
+          <w:bCs/>
+        </w:rPr>
+        <w:t xml:space="preserve">TRECHO  </w:t>
+      </w:r>
+      <w:r>
+        <w:rPr/>
+        <w:t>bagunca</w:t>
+      </w:r>
+    </w:p>
+    <w:p>
+      <w:pPr>
+        <w:pStyle w:val="Personagem"/>
+        <w:rPr/>
+      </w:pPr>
+      <w:r>
+        <w:rPr/>
+        <w:t xml:space="preserve">BALTAZAR (encantado)</w:t>
+      </w:r>
+    </w:p>
+    <w:p>
+      <w:pPr>
+        <w:pStyle w:val="Dialogo"/>
+        <w:rPr/>
+      </w:pPr>
+      <w:r>
+        <w:rPr/>
+        <w:t xml:space="preserve">Bagunça, não: estudo! Aquilo ali era uma das bestas. Desmanchei-a peça por peça. Não tem alma nem entranhas, só fios, como nervos de cobre.</w:t>
+      </w:r>
+    </w:p>
+    <w:p>
+      <w:pPr>
+        <w:pStyle w:val="Personagem"/>
+        <w:rPr/>
+      </w:pPr>
+      <w:r>
+        <w:rPr/>
+        <w:t xml:space="preserve">BALTAZAR</w:t>
+      </w:r>
+    </w:p>
+    <w:p>
+      <w:pPr>
+        <w:pStyle w:val="Dialogo"/>
+        <w:rPr/>
+      </w:pPr>
+      <w:r>
+        <w:rPr/>
+        <w:t xml:space="preserve">Os livros trouxe da Biblioteca. Entendo metade das letras e nenhuma das figuras. As estrelas da chapa são minhas: o céu de casa, como me lembro dele.</w:t>
+      </w:r>
+    </w:p>
+    <w:p>
+      <w:pPr>
+        <w:pStyle w:val="Personagem"/>
+        <w:rPr/>
+      </w:pPr>
+      <w:r>
+        <w:rPr/>
+        <w:t xml:space="preserve">GABRIEL</w:t>
+      </w:r>
+    </w:p>
+    <w:p>
+      <w:pPr>
+        <w:pStyle w:val="Dialogo"/>
+        <w:rPr/>
+      </w:pPr>
+      <w:r>
+        <w:rPr/>
+        <w:t xml:space="preserve">E as velas?</w:t>
+      </w:r>
+    </w:p>
+    <w:p>
+      <w:pPr>
+        <w:pStyle w:val="Personagem"/>
+        <w:rPr/>
+      </w:pPr>
+      <w:r>
+        <w:rPr/>
+        <w:t xml:space="preserve">BALTAZAR (rezando)</w:t>
+      </w:r>
+    </w:p>
+    <w:p>
+      <w:pPr>
+        <w:pStyle w:val="Dialogo"/>
+        <w:rPr/>
+      </w:pPr>
+      <w:r>
+        <w:rPr/>
+        <w:t xml:space="preserve">São para Nosso Senhor não se esquecer de onde estou.</w:t>
+      </w:r>
+    </w:p>
+    <w:p>
+      <w:pPr>
+        <w:pStyle w:val="Fluxo"/>
+        <w:rPr/>
+      </w:pPr>
+      <w:r>
+        <w:rPr/>
+        <w:t>segue para o trecho menu</w:t>
+      </w:r>
+    </w:p>
+    <w:p>
+      <w:pPr>
+        <w:pStyle w:val="Trecho"/>
+        <w:rPr/>
+      </w:pPr>
+      <w:r>
+        <w:rPr>
+          <w:b/>
+          <w:bCs/>
+        </w:rPr>
+        <w:t xml:space="preserve">TRECHO  </w:t>
+      </w:r>
+      <w:r>
+        <w:rPr/>
+        <w:t>convite</w:t>
+      </w:r>
+    </w:p>
+    <w:p>
+      <w:pPr>
+        <w:pStyle w:val="Personagem"/>
+        <w:rPr/>
+      </w:pPr>
+      <w:r>
+        <w:rPr/>
+        <w:t xml:space="preserve">BALTAZAR (aflito)</w:t>
+      </w:r>
+    </w:p>
+    <w:p>
+      <w:pPr>
+        <w:pStyle w:val="Dialogo"/>
+        <w:rPr/>
+      </w:pPr>
+      <w:r>
+        <w:rPr/>
+        <w:t xml:space="preserve">Outras pessoas? Ouço-as às vezes, nas caixas que falam pelos corredores. Vozes sem corpo, chamando no escuro.</w:t>
+      </w:r>
+    </w:p>
+    <w:p>
+      <w:pPr>
+        <w:pStyle w:val="Personagem"/>
+        <w:rPr/>
+      </w:pPr>
+      <w:r>
+        <w:rPr/>
+        <w:t xml:space="preserve">BALTAZAR (teimoso)</w:t>
+      </w:r>
+    </w:p>
+    <w:p>
+      <w:pPr>
+        <w:pStyle w:val="Dialogo"/>
+        <w:rPr/>
+      </w:pPr>
+      <w:r>
+        <w:rPr/>
+        <w:t xml:space="preserve">Não lhes respondo. Quem fala sem boca ou é anjo ou é demônio, e anjo não mora nestas covas.</w:t>
+      </w:r>
+    </w:p>
+    <w:p>
+      <w:pPr>
+        <w:pStyle w:val="Personagem"/>
+        <w:rPr/>
+      </w:pPr>
+      <w:r>
+        <w:rPr/>
+        <w:t xml:space="preserve">GABRIEL (preocupado)</w:t>
+      </w:r>
+    </w:p>
+    <w:p>
+      <w:pPr>
+        <w:pStyle w:val="Dialogo"/>
+        <w:rPr/>
+      </w:pPr>
+      <w:r>
+        <w:rPr/>
+        <w:t xml:space="preserve">É só um rádio. A Clarice fala por ele. Ela é gente, igual a mim.</w:t>
+      </w:r>
+    </w:p>
+    <w:p>
+      <w:pPr>
+        <w:pStyle w:val="Personagem"/>
+        <w:rPr/>
+      </w:pPr>
+      <w:r>
+        <w:rPr/>
+        <w:t xml:space="preserve">BALTAZAR (teimoso)</w:t>
+      </w:r>
+    </w:p>
+    <w:p>
+      <w:pPr>
+        <w:pStyle w:val="Dialogo"/>
+        <w:rPr/>
+      </w:pPr>
+      <w:r>
+        <w:rPr/>
+        <w:t xml:space="preserve">Pode ser. Mas lá fora andam as bestas, e aqui dentro elas não entram. Daqui não saio.</w:t>
+      </w:r>
+    </w:p>
+    <w:p>
+      <w:pPr>
+        <w:pStyle w:val="Personagem"/>
+        <w:rPr/>
+      </w:pPr>
+      <w:r>
+        <w:rPr/>
+        <w:t xml:space="preserve">BALTAZAR</w:t>
+      </w:r>
+    </w:p>
+    <w:p>
+      <w:pPr>
+        <w:pStyle w:val="Dialogo"/>
+        <w:rPr/>
+      </w:pPr>
+      <w:r>
+        <w:rPr/>
+        <w:t xml:space="preserve">Vossa Mercê, porém, pode voltar quando quiser. Basta apontar a sua luz para o Cruzeiro. Deixo a vela acesa.</w:t>
+      </w:r>
+    </w:p>
+    <w:p>
+      <w:pPr>
+        <w:pStyle w:val="Personagem"/>
+        <w:rPr/>
+      </w:pPr>
+      <w:r>
+        <w:rPr/>
+        <w:t xml:space="preserve">GABRIEL</w:t>
+      </w:r>
+    </w:p>
+    <w:p>
+      <w:pPr>
+        <w:pStyle w:val="Dialogo"/>
+        <w:rPr/>
+      </w:pPr>
+      <w:r>
+        <w:rPr/>
+        <w:t xml:space="preserve">Combinado. Só não gasta todas as velas.</w:t>
+      </w:r>
+    </w:p>
+    <w:p>
+      <w:pPr>
+        <w:pStyle w:val="Condicao"/>
+        <w:rPr/>
+      </w:pPr>
+      <w:r>
+        <w:rPr/>
+        <w:t xml:space="preserve">SE GABRIEL VOLTAR A FALAR COM ELE</w:t>
+      </w:r>
+    </w:p>
+    <w:p>
+      <w:pPr>
+        <w:pStyle w:val="Notaaotime"/>
+        <w:spacing w:before="0" w:after="60"/>
+        <w:rPr/>
+      </w:pPr>
+      <w:r>
+        <w:rPr/>
+        <w:t xml:space="preserve">Diálogo baltazar_labirinto_de_novo  (dados/dialogos/baltazar_labirinto_de_novo.json)</w:t>
+      </w:r>
+    </w:p>
+    <w:p>
+      <w:pPr>
+        <w:pStyle w:val="Personagem"/>
+        <w:rPr/>
+      </w:pPr>
+      <w:r>
+        <w:rPr/>
+        <w:t xml:space="preserve">BALTAZAR (encantado)</w:t>
+      </w:r>
+    </w:p>
+    <w:p>
+      <w:pPr>
+        <w:pStyle w:val="Dialogo"/>
+        <w:rPr/>
+      </w:pPr>
+      <w:r>
+        <w:rPr/>
+        <w:t xml:space="preserve">Vossa Mercê voltou! E inteiro, louvado seja.</w:t>
+      </w:r>
+    </w:p>
+    <w:p>
+      <w:pPr>
+        <w:pStyle w:val="Personagem"/>
+        <w:rPr/>
+      </w:pPr>
+      <w:r>
+        <w:rPr/>
+        <w:t xml:space="preserve">BALTAZAR</w:t>
+      </w:r>
+    </w:p>
+    <w:p>
+      <w:pPr>
+        <w:pStyle w:val="Dialogo"/>
+        <w:rPr/>
+      </w:pPr>
+      <w:r>
+        <w:rPr/>
+        <w:t xml:space="preserve">Lembre-se: as bestas de um olho só não veem quem lhes passa pelas costas. E luz forte no olho as cega pelo tempo de rezar um Credo.</w:t>
+      </w:r>
+    </w:p>
+    <w:p>
+      <w:pPr>
+        <w:pStyle w:val="Personagem"/>
+        <w:rPr/>
+      </w:pPr>
+      <w:r>
+        <w:rPr/>
+        <w:t xml:space="preserve">GABRIEL</w:t>
+      </w:r>
+    </w:p>
+    <w:p>
+      <w:pPr>
+        <w:pStyle w:val="Dialogo"/>
+        <w:rPr/>
+      </w:pPr>
+      <w:r>
+        <w:rPr/>
+        <w:t xml:space="preserve">Pelas costas, luz no olho. Anotado.</w:t>
+      </w:r>
+    </w:p>
+    <w:p>
+      <w:pPr>
+        <w:pStyle w:val="Heading3"/>
+        <w:rPr/>
+      </w:pPr>
+      <w:r>
+        <w:rPr/>
+        <w:t xml:space="preserve">Cena 3.4 — O Corredor do Tempo</w:t>
+      </w:r>
+    </w:p>
+    <w:p>
+      <w:pPr>
+        <w:pStyle w:val="Cena"/>
+        <w:rPr/>
+      </w:pPr>
+      <w:r>
+        <w:rPr/>
+        <w:t xml:space="preserve">INT. LABIRINTO – CORREDOR DO TEMPO – 3026</w:t>
+      </w:r>
+    </w:p>
+    <w:p>
+      <w:pPr>
+        <w:pStyle w:val="Notaaotime"/>
+        <w:spacing w:before="0" w:after="60"/>
+        <w:rPr/>
+      </w:pPr>
+      <w:r>
+        <w:rPr/>
+        <w:t xml:space="preserve">Sem falas. O corredor só tem documentos (a Folha de calibração, assinada “C.”, as etiquetas das fitas VHS e o selo do telefone) e avisos na tela. Estão no Roteiro, cena 3.4.</w:t>
+      </w:r>
+    </w:p>
+    <w:p>
+      <w:pPr>
+        <w:pStyle w:val="Heading3"/>
+        <w:rPr/>
+      </w:pPr>
+      <w:r>
+        <w:rPr/>
+        <w:t xml:space="preserve">Cena 3.5 — O alçapão</w:t>
       </w:r>
     </w:p>
     <w:p>
@@ -16697,7 +17815,95 @@
             </w:pPr>
             <w:r>
               <w:rPr/>
-              <w:t/>
+              <w:t>O Zane avisa, no Labirinto, de duas salas fora do mapa (a parede quente do corredor de cima e a porta âmbar): falas novas em zane_labirinto_primeiro_encontro e zane_labirinto_de_novo.</w:t>
+            </w:r>
+          </w:p>
+        </w:tc>
+      </w:tr>
+      <w:tr>
+        <w:trPr>
+          <w:trHeight w:val="480" w:hRule="atLeast"/>
+        </w:trPr>
+        <w:tc>
+          <w:tcPr>
+            <w:tcW w:w="1100" w:type="dxa"/>
+            <w:tcBorders>
+              <w:top w:val="single" w:sz="4" w:space="0" w:color="BFC9D1"/>
+              <w:start w:val="single" w:sz="4" w:space="0" w:color="BFC9D1"/>
+              <w:bottom w:val="single" w:sz="4" w:space="0" w:color="BFC9D1"/>
+              <w:end w:val="single" w:sz="4" w:space="0" w:color="BFC9D1"/>
+            </w:tcBorders>
+          </w:tcPr>
+          <w:p>
+            <w:pPr>
+              <w:pStyle w:val="Normal"/>
+              <w:rPr/>
+            </w:pPr>
+            <w:r>
+              <w:rPr/>
+              <w:t>0.3</w:t>
+            </w:r>
+          </w:p>
+        </w:tc>
+        <w:tc>
+          <w:tcPr>
+            <w:tcW w:w="1400" w:type="dxa"/>
+            <w:tcBorders>
+              <w:top w:val="single" w:sz="4" w:space="0" w:color="BFC9D1"/>
+              <w:start w:val="single" w:sz="4" w:space="0" w:color="BFC9D1"/>
+              <w:bottom w:val="single" w:sz="4" w:space="0" w:color="BFC9D1"/>
+              <w:end w:val="single" w:sz="4" w:space="0" w:color="BFC9D1"/>
+            </w:tcBorders>
+          </w:tcPr>
+          <w:p>
+            <w:pPr>
+              <w:pStyle w:val="Normal"/>
+              <w:rPr/>
+            </w:pPr>
+            <w:r>
+              <w:rPr/>
+              <w:t>29/10/2026</w:t>
+            </w:r>
+          </w:p>
+        </w:tc>
+        <w:tc>
+          <w:tcPr>
+            <w:tcW w:w="2000" w:type="dxa"/>
+            <w:tcBorders>
+              <w:top w:val="single" w:sz="4" w:space="0" w:color="BFC9D1"/>
+              <w:start w:val="single" w:sz="4" w:space="0" w:color="BFC9D1"/>
+              <w:bottom w:val="single" w:sz="4" w:space="0" w:color="BFC9D1"/>
+              <w:end w:val="single" w:sz="4" w:space="0" w:color="BFC9D1"/>
+            </w:tcBorders>
+          </w:tcPr>
+          <w:p>
+            <w:pPr>
+              <w:pStyle w:val="Normal"/>
+              <w:rPr/>
+            </w:pPr>
+            <w:r>
+              <w:rPr/>
+            </w:r>
+          </w:p>
+        </w:tc>
+        <w:tc>
+          <w:tcPr>
+            <w:tcW w:w="4526" w:type="dxa"/>
+            <w:tcBorders>
+              <w:top w:val="single" w:sz="4" w:space="0" w:color="BFC9D1"/>
+              <w:start w:val="single" w:sz="4" w:space="0" w:color="BFC9D1"/>
+              <w:bottom w:val="single" w:sz="4" w:space="0" w:color="BFC9D1"/>
+              <w:end w:val="single" w:sz="4" w:space="0" w:color="BFC9D1"/>
+            </w:tcBorders>
+          </w:tcPr>
+          <w:p>
+            <w:pPr>
+              <w:pStyle w:val="Normal"/>
+              <w:rPr/>
+            </w:pPr>
+            <w:r>
+              <w:rPr/>
+              <w:t>Cena 3.3, o esconderijo do Baltazar (as duas conversas dele no Labirinto), e cena 3.4, o Corredor do Tempo (sem falas). O alçapão passa a ser a cena 3.5.</w:t>
             </w:r>
           </w:p>
         </w:tc>

</xml_diff>

<commit_message>
feat: a Clarice conta no primeiro encontro que a Diana fugiu para investigar
Logo depois da desculpa do brinco, a Clarice entrega que a Diana pulou a
barricada para fuçar as galerias, e a Diana protesta que foi investigar.

Co-Authored-By: Claude Opus 5.5 <noreply@anthropic.com>
</commit_message>
<xml_diff>
--- a/docs/historia/dialogos/Dialogos.docx
+++ b/docs/historia/dialogos/Dialogos.docx
@@ -5497,6 +5497,86 @@
       <w:r>
         <w:rPr/>
         <w:t>oiii eu estava procurando meu brinco naquela bagunça, esse lugar tá péssimo, é verdade que você é de 2026, que loucura tem carro voador mesmo?</w:t>
+      </w:r>
+    </w:p>
+    <w:p>
+      <w:pPr>
+        <w:pStyle w:val="Personagem"/>
+        <w:rPr/>
+      </w:pPr>
+      <w:r>
+        <w:rPr/>
+        <w:t xml:space="preserve">CLARICE (séria)</w:t>
+      </w:r>
+    </w:p>
+    <w:p>
+      <w:pPr>
+        <w:pStyle w:val="Dialogonovo"/>
+        <w:rPr/>
+      </w:pPr>
+      <w:r>
+        <w:rPr/>
+        <w:t xml:space="preserve">Brinco. Sei. Ela pulou a barricada de novo pra fuçar as galerias da obra. Eu falei: ninguém sai da 103.</w:t>
+      </w:r>
+    </w:p>
+    <w:p>
+      <w:pPr>
+        <w:pStyle w:val="Personagem"/>
+        <w:rPr/>
+      </w:pPr>
+      <w:r>
+        <w:rPr/>
+        <w:t xml:space="preserve">DIANA (dramática)</w:t>
+      </w:r>
+    </w:p>
+    <w:p>
+      <w:pPr>
+        <w:pStyle w:val="Dialogonovo"/>
+        <w:rPr/>
+      </w:pPr>
+      <w:r>
+        <w:rPr/>
+        <w:t xml:space="preserve">Protesto! Eu fui investigar! Alguém construiu tudo isso aqui, e eu vou descobrir quem.</w:t>
+      </w:r>
+    </w:p>
+    <w:p>
+      <w:pPr>
+        <w:pStyle w:val="Personagem"/>
+        <w:rPr/>
+      </w:pPr>
+      <w:r>
+        <w:rPr/>
+        <w:t xml:space="preserve">CLARICE (séria)</w:t>
+      </w:r>
+    </w:p>
+    <w:p>
+      <w:pPr>
+        <w:pStyle w:val="Dialogonovo"/>
+        <w:rPr/>
+      </w:pPr>
+      <w:r>
+        <w:rPr/>
+        <w:t xml:space="preserve">Investiga daqui de dentro. Com a barricada fechada.</w:t>
+      </w:r>
+    </w:p>
+    <w:p>
+      <w:pPr>
+        <w:pStyle w:val="Personagem"/>
+        <w:rPr/>
+      </w:pPr>
+      <w:r>
+        <w:rPr/>
+        <w:t xml:space="preserve">DIANA (ansiosa)</w:t>
+      </w:r>
+    </w:p>
+    <w:p>
+      <w:pPr>
+        <w:pStyle w:val="Dialogonovo"/>
+        <w:rPr/>
+      </w:pPr>
+      <w:r>
+        <w:rPr/>
+        <w:t xml:space="preserve">Tá, tá. Mas e aí, tem carro voador ou não?</w:t>
       </w:r>
     </w:p>
     <w:p>

</xml_diff>

<commit_message>
feat: as falas do Zane no tom frio e a pista da sala sem ninguém dentro
37 falas sem empolgação, com números e frases secas, sem mudar o que ele
informa. A parede quente vira um vão que não está em planta nenhuma, e
as duas falas cortadas de zane_convivencia_01 ficaram mais curtas.

Co-Authored-By: Claude Opus 5.5 <noreply@anthropic.com>
</commit_message>
<xml_diff>
--- a/docs/historia/dialogos/Dialogos.docx
+++ b/docs/historia/dialogos/Dialogos.docx
@@ -3316,7 +3316,7 @@
       </w:pPr>
       <w:r>
         <w:rPr/>
-        <w:t>Alô? Alô! Finalmente. Sabe quantas vezes eu chamei esse balcão? Perdi a conta.</w:t>
+        <w:t xml:space="preserve">Alô. Finalmente. Chamei esse balcão quarenta e três vezes.</w:t>
       </w:r>
     </w:p>
     <w:p>
@@ -3356,7 +3356,7 @@
       </w:pPr>
       <w:r>
         <w:rPr/>
-        <w:t>Calma, calma! É pergunta demais pra uma linha só. Infelizmente não dá pra explicar tudo por aqui: a Clarice te explica quando você chegar até ela.</w:t>
+        <w:t xml:space="preserve">Uma pergunta por vez. É pergunta demais pra uma linha só. Infelizmente não dá pra explicar tudo por aqui: a Clarice te explica quando você chegar até ela.</w:t>
       </w:r>
     </w:p>
     <w:p>
@@ -3456,7 +3456,7 @@
       </w:pPr>
       <w:r>
         <w:rPr/>
-        <w:t>Ih, escapou. Isso é papo longo e a linha tá ruim: depois você junta as peças.</w:t>
+        <w:t xml:space="preserve">Escapou. Erro meu. Isso é papo longo e a linha tá ruim: depois você junta as peças.</w:t>
       </w:r>
     </w:p>
     <w:p>
@@ -3486,7 +3486,7 @@
       </w:pPr>
       <w:r>
         <w:rPr/>
-        <w:t>Eu sou o Zane. Agora sai da Biblioteca. E não fica embaixo das luzes, sério. Fui!</w:t>
+        <w:t xml:space="preserve">Eu sou o Zane. Agora sai da Biblioteca. E não fica embaixo das luzes. Desligando.</w:t>
       </w:r>
     </w:p>
     <w:p>
@@ -7143,7 +7143,7 @@
       </w:pPr>
       <w:r>
         <w:rPr/>
-        <w:t>Chhh... Atenção, frequência! O sensor da porta corta-fogo do bloco acusou aberta. Foi o Gabriel?</w:t>
+        <w:t xml:space="preserve">Chhh... Frequência. O sensor da porta corta-fogo do bloco acusou aberta. Foi o Gabriel?</w:t>
       </w:r>
     </w:p>
     <w:p>
@@ -7303,7 +7303,7 @@
       </w:pPr>
       <w:r>
         <w:rPr/>
-        <w:t>Despluga, Diana. Ele passou por dois andares de robô. Tá zerado.</w:t>
+        <w:t xml:space="preserve">Despluga, Diana. Ele passou por dois andares de robô. A chance de dar errado agora é baixa.</w:t>
       </w:r>
     </w:p>
     <w:p>
@@ -8835,17 +8835,17 @@
       </w:pPr>
       <w:r>
         <w:rPr/>
-        <w:t>ZANE (confiante)</w:t>
-      </w:r>
-    </w:p>
-    <w:p>
-      <w:pPr>
-        <w:pStyle w:val="Dialogo"/>
-        <w:rPr/>
-      </w:pPr>
-      <w:r>
-        <w:rPr/>
-        <w:t>Olha só: gente de carne e osso! Eu sabia que o sinal ia te puxar pra cá. Zane. A voz do telefone, lembra?</w:t>
+        <w:t xml:space="preserve">ZANE</w:t>
+      </w:r>
+    </w:p>
+    <w:p>
+      <w:pPr>
+        <w:pStyle w:val="Dialogo"/>
+        <w:rPr/>
+      </w:pPr>
+      <w:r>
+        <w:rPr/>
+        <w:t xml:space="preserve">Gente de carne e osso. O sinal do seu rádio te trouxe pra cá, como eu calculei. Zane. A voz do telefone.</w:t>
       </w:r>
     </w:p>
     <w:p>
@@ -8885,7 +8885,7 @@
       </w:pPr>
       <w:r>
         <w:rPr/>
-        <w:t>Destranquei! De longe é fácil. Aqui embaixo é outra história: a rede do subsolo é fechada, de fora eu não passo nem com reza.</w:t>
+        <w:t xml:space="preserve">Destranquei. De longe é fácil. Aqui embaixo é outra história: a rede do subsolo é fechada. De fora, zero acesso.</w:t>
       </w:r>
     </w:p>
     <w:p>
@@ -9128,7 +9128,7 @@
       </w:pPr>
       <w:r>
         <w:rPr/>
-        <w:t>Toma o meu notebook de pesquisa. Chega perto do terminal do nó, equipa e aciona: abre um joguinho de invasão. Acertou, o nó cai.</w:t>
+        <w:t xml:space="preserve">Toma o meu notebook de pesquisa. Chega perto do terminal do nó, equipa e aciona: abre a invasão. Acertou, o nó cai.</w:t>
       </w:r>
     </w:p>
     <w:p>
@@ -9312,17 +9312,17 @@
       </w:pPr>
       <w:r>
         <w:rPr/>
-        <w:t>ZANE (frustrado)</w:t>
-      </w:r>
-    </w:p>
-    <w:p>
-      <w:pPr>
-        <w:pStyle w:val="Dialogo"/>
-        <w:rPr/>
-      </w:pPr>
-      <w:r>
-        <w:rPr/>
-        <w:t>Mas ele nunca pede ajuda, nunca chama ninguém pra lá. Ninguém conserta nada sozinho e calado desse jeito. Ninguém.</w:t>
+        <w:t xml:space="preserve">ZANE (desconfiado)</w:t>
+      </w:r>
+    </w:p>
+    <w:p>
+      <w:pPr>
+        <w:pStyle w:val="Dialogo"/>
+        <w:rPr/>
+      </w:pPr>
+      <w:r>
+        <w:rPr/>
+        <w:t xml:space="preserve">Mas ele nunca pede ajuda, nunca chama ninguém pra lá. Conserto sem dado compartilhado não é conserto. Não fecha.</w:t>
       </w:r>
     </w:p>
     <w:p>
@@ -9342,7 +9342,7 @@
       </w:pPr>
       <w:r>
         <w:rPr/>
-        <w:t>Sei lá. Pode ser só o jeito dele. É por isso que eu quero ver.</w:t>
+        <w:t xml:space="preserve">Pode ser só o jeito dele. Probabilidade baixa. É por isso que eu quero ver.</w:t>
       </w:r>
     </w:p>
     <w:p>
@@ -9502,7 +9502,7 @@
       </w:pPr>
       <w:r>
         <w:rPr/>
-        <w:t>Boa! Toma. E ó: cuidado com ele, tá? É o único que eu tenho.</w:t>
+        <w:t xml:space="preserve">Toma. É o único que eu tenho. Devolve inteiro.</w:t>
       </w:r>
     </w:p>
     <w:p>
@@ -9562,7 +9562,7 @@
       </w:pPr>
       <w:r>
         <w:rPr/>
-        <w:t xml:space="preserve">Ah, e duas coisas que não batem com o meu mapa. Uma parede no corredor de cima esquenta toda noite, como se tivesse gente do outro lado.</w:t>
+        <w:t xml:space="preserve">Mais duas coisas que não batem com o meu mapa. Atrás de uma parede no corredor de cima tem um vão de oito por cinco que não está em planta nenhuma.</w:t>
       </w:r>
     </w:p>
     <w:p>
@@ -9602,17 +9602,17 @@
       </w:pPr>
       <w:r>
         <w:rPr/>
-        <w:t xml:space="preserve">Robô é frio. Aquilo é quente que nem gente. Quando passar por lá, aponta a lanterna pra parede. Luz mostra o que o concreto esconde.</w:t>
-      </w:r>
-    </w:p>
-    <w:p>
-      <w:pPr>
-        <w:pStyle w:val="Personagem"/>
-        <w:rPr/>
-      </w:pPr>
-      <w:r>
-        <w:rPr/>
-        <w:t xml:space="preserve">ZANE (empolgado)</w:t>
+        <w:t xml:space="preserve">Robô não atravessa parede. Alguém fechou esse vão de propósito. Quando passar por lá, aponta a lanterna pra parede: luz mostra o que o concreto esconde.</w:t>
+      </w:r>
+    </w:p>
+    <w:p>
+      <w:pPr>
+        <w:pStyle w:val="Personagem"/>
+        <w:rPr/>
+      </w:pPr>
+      <w:r>
+        <w:rPr/>
+        <w:t xml:space="preserve">ZANE (concentrado)</w:t>
       </w:r>
     </w:p>
     <w:p>
@@ -9662,7 +9662,7 @@
       </w:pPr>
       <w:r>
         <w:rPr/>
-        <w:t xml:space="preserve">Opcional! Mas ninguém monta sala de teste à toa. Quem testou alguma coisa ali deixou rastro. Se der tempo, vai.</w:t>
+        <w:t xml:space="preserve">Opcional. Mas ninguém monta sala de teste à toa: quem testou alguma coisa ali deixou rastro. Se der tempo, vai.</w:t>
       </w:r>
     </w:p>
     <w:p>
@@ -9693,17 +9693,17 @@
       </w:pPr>
       <w:r>
         <w:rPr/>
-        <w:t>ZANE (assustado)</w:t>
-      </w:r>
-    </w:p>
-    <w:p>
-      <w:pPr>
-        <w:pStyle w:val="Dialogo"/>
-        <w:rPr/>
-      </w:pPr>
-      <w:r>
-        <w:rPr/>
-        <w:t>Ei, o notebook! Você ia sem ele? Toma. Cuidado com ele, é o único que eu tenho.</w:t>
+        <w:t xml:space="preserve">ZANE</w:t>
+      </w:r>
+    </w:p>
+    <w:p>
+      <w:pPr>
+        <w:pStyle w:val="Dialogo"/>
+        <w:rPr/>
+      </w:pPr>
+      <w:r>
+        <w:rPr/>
+        <w:t xml:space="preserve">O notebook. Você ia sem ele. Toma. É o único que eu tenho.</w:t>
       </w:r>
     </w:p>
     <w:p>
@@ -10002,7 +10002,7 @@
       </w:pPr>
       <w:r>
         <w:rPr/>
-        <w:t>Voltou inteiro? Ainda tem nó pra cair. O terminal fica no meio de cada salão.</w:t>
+        <w:t xml:space="preserve">Voltou. Ainda tem nó pra cair. O terminal fica no meio de cada salão.</w:t>
       </w:r>
     </w:p>
     <w:p>
@@ -10159,7 +10159,7 @@
       </w:pPr>
       <w:r>
         <w:rPr/>
-        <w:t>Toma o meu notebook de pesquisa. Chega perto do terminal do nó, equipa e aciona: abre um joguinho de invasão. Acertou, o nó cai.</w:t>
+        <w:t xml:space="preserve">Toma o meu notebook de pesquisa. Chega perto do terminal do nó, equipa e aciona: abre a invasão. Acertou, o nó cai.</w:t>
       </w:r>
     </w:p>
     <w:p>
@@ -10343,17 +10343,17 @@
       </w:pPr>
       <w:r>
         <w:rPr/>
-        <w:t>ZANE (frustrado)</w:t>
-      </w:r>
-    </w:p>
-    <w:p>
-      <w:pPr>
-        <w:pStyle w:val="Dialogo"/>
-        <w:rPr/>
-      </w:pPr>
-      <w:r>
-        <w:rPr/>
-        <w:t>Mas ele nunca pede ajuda, nunca chama ninguém pra lá. Ninguém conserta nada sozinho e calado desse jeito. Ninguém.</w:t>
+        <w:t xml:space="preserve">ZANE (desconfiado)</w:t>
+      </w:r>
+    </w:p>
+    <w:p>
+      <w:pPr>
+        <w:pStyle w:val="Dialogo"/>
+        <w:rPr/>
+      </w:pPr>
+      <w:r>
+        <w:rPr/>
+        <w:t xml:space="preserve">Mas ele nunca pede ajuda, nunca chama ninguém pra lá. Conserto sem dado compartilhado não é conserto. Não fecha.</w:t>
       </w:r>
     </w:p>
     <w:p>
@@ -10373,7 +10373,7 @@
       </w:pPr>
       <w:r>
         <w:rPr/>
-        <w:t>Sei lá. Pode ser só o jeito dele. É por isso que eu quero ver.</w:t>
+        <w:t xml:space="preserve">Pode ser só o jeito dele. Probabilidade baixa. É por isso que eu quero ver.</w:t>
       </w:r>
     </w:p>
     <w:p>
@@ -10420,7 +10420,7 @@
       </w:pPr>
       <w:r>
         <w:rPr/>
-        <w:t xml:space="preserve">A parede do corredor de cima continua quente. Aponta a lanterna pra ela quando passar: luz mostra o que o concreto esconde.</w:t>
+        <w:t xml:space="preserve">A parede do corredor de cima continua sem bater com a planta. Aponta a lanterna pra ela quando passar: luz mostra o que o concreto esconde.</w:t>
       </w:r>
     </w:p>
     <w:p>
@@ -10624,7 +10624,7 @@
       </w:pPr>
       <w:r>
         <w:rPr/>
-        <w:t>Vai com calma. E apaga a lanterna na hora certa!</w:t>
+        <w:t xml:space="preserve">Vai. E apaga a lanterna na hora certa.</w:t>
       </w:r>
     </w:p>
     <w:p>
@@ -10665,7 +10665,7 @@
       </w:pPr>
       <w:r>
         <w:rPr/>
-        <w:t>Chhh... Dois de três! Tá voando, Gabriel.</w:t>
+        <w:t xml:space="preserve">Chhh... Dois de três. O tempo por nó tá caindo. Bom.</w:t>
       </w:r>
     </w:p>
     <w:p>
@@ -10886,7 +10886,7 @@
       </w:pPr>
       <w:r>
         <w:rPr/>
-        <w:t>Chhh... Gabriel? Três de três! O sistema do subsolo acabou de me dar acesso.</w:t>
+        <w:t xml:space="preserve">Chhh... Gabriel. Três de três. O sistema do subsolo acabou de me dar acesso.</w:t>
       </w:r>
     </w:p>
     <w:p>
@@ -11847,7 +11847,7 @@
       </w:pPr>
       <w:r>
         <w:rPr/>
-        <w:t>Três de três! Eu senti daqui: o sistema do subsolo inteiro piscou e a trava soltou. Você é bom nisso, hein?</w:t>
+        <w:t xml:space="preserve">Três de três. O sistema do subsolo inteiro piscou e a trava soltou. Cem por cento de acerto. Nada mal.</w:t>
       </w:r>
     </w:p>
     <w:p>
@@ -11917,17 +11917,17 @@
       </w:pPr>
       <w:r>
         <w:rPr/>
-        <w:t>ZANE (assustado)</w:t>
-      </w:r>
-    </w:p>
-    <w:p>
-      <w:pPr>
-        <w:pStyle w:val="Dialogo"/>
-        <w:rPr/>
-      </w:pPr>
-      <w:r>
-        <w:rPr/>
-        <w:t>Debaixo daquela lona, do meu lado! Eu passei esse tempo todo em cima de uma saída e só mapeei agora que a trava soltou. Nem me fala.</w:t>
+        <w:t xml:space="preserve">ZANE (frustrado)</w:t>
+      </w:r>
+    </w:p>
+    <w:p>
+      <w:pPr>
+        <w:pStyle w:val="Dialogo"/>
+        <w:rPr/>
+      </w:pPr>
+      <w:r>
+        <w:rPr/>
+        <w:t xml:space="preserve">Debaixo daquela lona, do meu lado. Passei esse tempo todo em cima de uma saída e só mapeei agora que a trava soltou. Erro meu.</w:t>
       </w:r>
     </w:p>
     <w:p>
@@ -11967,7 +11967,7 @@
       </w:pPr>
       <w:r>
         <w:rPr/>
-        <w:t>E a trava do bunker soltou junto. Vai na frente, eu te guio pelo rádio. E fica de olho no Henrique, tá?</w:t>
+        <w:t xml:space="preserve">E a trava do bunker soltou junto. Vai na frente, eu te guio pelo rádio. E fica de olho no Henrique.</w:t>
       </w:r>
     </w:p>
     <w:p>
@@ -12008,7 +12008,7 @@
       </w:pPr>
       <w:r>
         <w:rPr/>
-        <w:t>O alçapão tá aberto, do meu lado. Desce logo, antes que os robôs achem o duto. Eu vou atrás!</w:t>
+        <w:t xml:space="preserve">O alçapão tá aberto. Cada minuto aqui aumenta a chance de um robô achar o duto. Desce. Eu vou atrás.</w:t>
       </w:r>
     </w:p>
     <w:p>
@@ -12943,27 +12943,27 @@
       </w:pPr>
       <w:r>
         <w:rPr/>
-        <w:t>Chhh... Gabriel? Você saiu na passarela do Centro de Convivência! Tô vendo o sinal do seu rádio daqui.</w:t>
-      </w:r>
-    </w:p>
-    <w:p>
-      <w:pPr>
-        <w:pStyle w:val="Dialogo"/>
-        <w:rPr/>
-      </w:pPr>
-      <w:r>
-        <w:rPr/>
-        <w:t>Cuidado aí embaixo: a praça de alimentação fica sob uma cúpula de vidro quebrada, com duas Sentinelas rondando as mesas, e o luar entrega qualquer um. Usa as mesas, as árvores e os nichos de manutenção pra cortar a linha de visão.</w:t>
-      </w:r>
-    </w:p>
-    <w:p>
-      <w:pPr>
-        <w:pStyle w:val="Dialogo"/>
-        <w:rPr/>
-      </w:pPr>
-      <w:r>
-        <w:rPr/>
-        <w:t>O elevador de carga que desce pro Bunker fica nos fundos do Churrasco Solar, mas tá sem energia. Entra na Tapioca Orbital: é uma sala segura, e a ordem de serviço de lá diz onde guardaram a célula reserva.</w:t>
+        <w:t xml:space="preserve">Chhh... Gabriel. Seu rádio acusou a passarela do Centro de Convivência. Tô vendo o sinal daqui.</w:t>
+      </w:r>
+    </w:p>
+    <w:p>
+      <w:pPr>
+        <w:pStyle w:val="Dialogo"/>
+        <w:rPr/>
+      </w:pPr>
+      <w:r>
+        <w:rPr/>
+        <w:t xml:space="preserve">A praça fica sob uma cúpula de vidro quebrada. Duas Sentinelas rondam as mesas, e o luar entrega qualquer um. Usa mesas, árvores e nichos pra cortar a visão.</w:t>
+      </w:r>
+    </w:p>
+    <w:p>
+      <w:pPr>
+        <w:pStyle w:val="Dialogo"/>
+        <w:rPr/>
+      </w:pPr>
+      <w:r>
+        <w:rPr/>
+        <w:t xml:space="preserve">O elevador pro Bunker fica nos fundos do Churrasco Solar, sem energia. Na Tapioca Orbital, que é sala segura, a ordem de serviço diz onde está a célula.</w:t>
       </w:r>
     </w:p>
     <w:p>
@@ -13215,17 +13215,17 @@
       </w:pPr>
       <w:r>
         <w:rPr/>
-        <w:t>Chhh... Boa, Gabriel! A comutação trifásica da cozinha funcionou e o elevador de carga do Churrasco Solar liberou!</w:t>
-      </w:r>
-    </w:p>
-    <w:p>
-      <w:pPr>
-        <w:pStyle w:val="Dialogo"/>
-        <w:rPr/>
-      </w:pPr>
-      <w:r>
-        <w:rPr/>
-        <w:t>Mas ó: a energia acendeu também os letreiros e os holofotes da cúpula, e as Sentinelas mudaram de rota. Fica nas sombras até chegar no elevador!</w:t>
+        <w:t xml:space="preserve">Chhh... Comutação trifásica da cozinha: correta. O elevador de carga do Churrasco Solar liberou.</w:t>
+      </w:r>
+    </w:p>
+    <w:p>
+      <w:pPr>
+        <w:pStyle w:val="Dialogo"/>
+        <w:rPr/>
+      </w:pPr>
+      <w:r>
+        <w:rPr/>
+        <w:t xml:space="preserve">Efeito colateral: a energia acendeu os letreiros e os holofotes da cúpula, e as Sentinelas mudaram de rota. Fica nas sombras até o elevador.</w:t>
       </w:r>
     </w:p>
     <w:p>
@@ -16365,7 +16365,7 @@
       </w:pPr>
       <w:r>
         <w:rPr/>
-        <w:t>Ei. "Nem o Zane"? Eu quebro qualquer coisa. Com energia.</w:t>
+        <w:t xml:space="preserve">Correção: "nem o Zane" não existe. Eu quebro qualquer coisa. Com energia.</w:t>
       </w:r>
     </w:p>
     <w:p>
@@ -16416,7 +16416,7 @@
       </w:pPr>
       <w:r>
         <w:rPr/>
-        <w:t>Chhh... Gabriel? A luz voltou aqui também! Foi você no gerador?</w:t>
+        <w:t xml:space="preserve">Chhh... Gabriel. A luz voltou aqui também. Foi você no gerador.</w:t>
       </w:r>
     </w:p>
     <w:p>
@@ -16484,17 +16484,17 @@
       </w:pPr>
       <w:r>
         <w:rPr/>
-        <w:t>ZANE (empolgado)</w:t>
-      </w:r>
-    </w:p>
-    <w:p>
-      <w:pPr>
-        <w:pStyle w:val="Dialogo"/>
-        <w:rPr/>
-      </w:pPr>
-      <w:r>
-        <w:rPr/>
-        <w:t>Gabriel! Até que enfim! Viu a luz voltar? Com energia, o sistema do setor B baixou a guarda. Doze caracteres, três tentativas por vez... e quebrei.</w:t>
+        <w:t xml:space="preserve">ZANE</w:t>
+      </w:r>
+    </w:p>
+    <w:p>
+      <w:pPr>
+        <w:pStyle w:val="Dialogo"/>
+        <w:rPr/>
+      </w:pPr>
+      <w:r>
+        <w:rPr/>
+        <w:t xml:space="preserve">Gabriel. Até que enfim. A luz voltou e o sistema do setor B baixou a guarda. Doze caracteres, três tentativas por vez. Quebrei na quarta rodada.</w:t>
       </w:r>
     </w:p>
     <w:p>

</xml_diff>